<commit_message>
Update: Bao cao tu hoc ban don gian kieu sinh vien - bo muc luc, dien ten Ho Quang Huy 24S1020030, 23 trang
</commit_message>
<xml_diff>
--- a/Bao-cao-tu-hoc-Self-study-Tieng-Anh-B1.docx
+++ b/Bao-cao-tu-hoc-Self-study-Tieng-Anh-B1.docx
@@ -34,7 +34,7 @@
           </w:tcPr>
           <w:p>
             <w:pPr>
-              <w:spacing w:before="4092"/>
+              <w:spacing w:before="4389"/>
             </w:pPr>
           </w:p>
           <w:p>
@@ -102,7 +102,7 @@
                 <w:sz w:val="24"/>
                 <w:szCs w:val="24"/>
               </w:rPr>
-              <w:t xml:space="preserve">Tổng kết hệ thống kiến thức đã học: Unit 1–10 · Động từ khuyết khuyết · Câu điều kiện · Viết email · Speaking · Bài tập tự luyện có đáp án</w:t>
+              <w:t xml:space="preserve">Tổng kết kiến thức đã học: Unit 1–10 · Viết email · Speaking · Bài tập tự luyện</w:t>
             </w:r>
           </w:p>
           <w:p>
@@ -120,7 +120,7 @@
                 <w:sz w:val="24"/>
                 <w:szCs w:val="24"/>
               </w:rPr>
-              <w:t xml:space="preserve">Họ và tên: ...................................................</w:t>
+              <w:t xml:space="preserve">Họ và tên: Hồ Quang Huy</w:t>
             </w:r>
           </w:p>
           <w:p>
@@ -138,48 +138,12 @@
                 <w:sz w:val="24"/>
                 <w:szCs w:val="24"/>
               </w:rPr>
-              <w:t xml:space="preserve">Lớp: ..........................   Mã sinh viên: ..........................</w:t>
-            </w:r>
-          </w:p>
-          <w:p>
-            <w:pPr>
-              <w:pBdr>
-                <w:left w:val="single" w:color="3CB4A0" w:sz="8" w:space="12"/>
-              </w:pBdr>
-              <w:spacing w:after="80" w:line="312"/>
-              <w:ind w:left="1400" w:right="800"/>
-            </w:pPr>
-            <w:r>
-              <w:rPr>
-                <w:rFonts w:ascii="Arial" w:eastAsia="Arial" w:hAnsi="Arial"/>
-                <w:color w:val="E6F4F1"/>
-                <w:sz w:val="24"/>
-                <w:szCs w:val="24"/>
-              </w:rPr>
-              <w:t xml:space="preserve">Giảng viên: ...................................................</w:t>
-            </w:r>
-          </w:p>
-          <w:p>
-            <w:pPr>
-              <w:pBdr>
-                <w:left w:val="single" w:color="3CB4A0" w:sz="8" w:space="12"/>
-              </w:pBdr>
-              <w:spacing w:after="80" w:line="312"/>
-              <w:ind w:left="1400" w:right="800"/>
-            </w:pPr>
-            <w:r>
-              <w:rPr>
-                <w:rFonts w:ascii="Arial" w:eastAsia="Arial" w:hAnsi="Arial"/>
-                <w:color w:val="E6F4F1"/>
-                <w:sz w:val="24"/>
-                <w:szCs w:val="24"/>
-              </w:rPr>
-              <w:t xml:space="preserve">Học phần: Tiếng Anh B1</w:t>
-            </w:r>
-          </w:p>
-          <w:p>
-            <w:pPr>
-              <w:spacing w:before="4092"/>
+              <w:t xml:space="preserve">Mã sinh viên: 24S1020030</w:t>
+            </w:r>
+          </w:p>
+          <w:p>
+            <w:pPr>
+              <w:spacing w:before="4389"/>
             </w:pPr>
           </w:p>
           <w:p>
@@ -197,7 +161,7 @@
                 <w:sz w:val="16"/>
                 <w:szCs w:val="16"/>
               </w:rPr>
-              <w:t xml:space="preserve">Self-study notes – Unit 1–10</w:t>
+              <w:t xml:space="preserve">Tiếng Anh B1</w:t>
             </w:r>
             <w:r>
               <w:rPr>
@@ -229,8 +193,9 @@
     </w:p>
     <w:p>
       <w:pPr>
-        <w:spacing w:after="360" w:before="480" w:line="380" w:lineRule="atLeast"/>
-        <w:jc w:val="center"/>
+        <w:pStyle w:val="Heading1"/>
+        <w:keepNext/>
+        <w:spacing w:after="160" w:before="360" w:line="380" w:lineRule="atLeast"/>
       </w:pPr>
       <w:r>
         <w:rPr>
@@ -241,2572 +206,23 @@
           <w:sz w:val="32"/>
           <w:szCs w:val="32"/>
         </w:rPr>
-        <w:t xml:space="preserve">MỤC LỤC</w:t>
-      </w:r>
-    </w:p>
-    <w:sdt>
-      <w:sdtPr>
-        <w:alias w:val="Table of Contents"/>
-      </w:sdtPr>
-      <w:sdtContent>
-        <w:p>
-          <w:r>
-            <w:fldChar w:fldCharType="begin" w:dirty="true"/>
-          </w:r>
-          <w:r>
-            <w:instrText xml:space="preserve">TOC \h \o "1-2"</w:instrText>
-          </w:r>
-          <w:r>
-            <w:fldChar w:fldCharType="separate"/>
-          </w:r>
-        </w:p>
-        <w:p>
-          <w:pPr>
-            <w:pStyle w:val="9"/>
-            <w:tabs>
-              <w:tab w:val="right" w:leader="dot" w:pos="9026"/>
-            </w:tabs>
-            <w:spacing w:before="120" w:after="60"/>
-          </w:pPr>
-          <w:hyperlink w:anchor="_Toc100000" w:history="1">
-            <w:r>
-              <w:rPr>
-                <w:rStyle w:val="Hyperlink"/>
-              </w:rPr>
-              <w:t>PHẦN MỞ ĐẦU</w:t>
-            </w:r>
-            <w:r>
-              <w:tab/>
-            </w:r>
-            <w:r>
-              <w:fldChar w:fldCharType="begin"/>
-            </w:r>
-            <w:r>
-              <w:instrText xml:space="preserve"> PAGEREF _Toc100000 \h </w:instrText>
-            </w:r>
-            <w:r>
-              <w:fldChar w:fldCharType="separate"/>
-            </w:r>
-            <w:r>
-              <w:t>1</w:t>
-            </w:r>
-            <w:r>
-              <w:fldChar w:fldCharType="end"/>
-            </w:r>
-          </w:hyperlink>
-        </w:p>
-        <w:p>
-          <w:pPr>
-            <w:pStyle w:val="11"/>
-            <w:ind w:left="360"/>
-            <w:tabs>
-              <w:tab w:val="right" w:leader="dot" w:pos="9026"/>
-            </w:tabs>
-            <w:spacing w:before="120" w:after="60"/>
-          </w:pPr>
-          <w:hyperlink w:anchor="_Toc100001" w:history="1">
-            <w:r>
-              <w:rPr>
-                <w:rStyle w:val="Hyperlink"/>
-              </w:rPr>
-              <w:t>1. Lý do và mục đích tự học</w:t>
-            </w:r>
-            <w:r>
-              <w:tab/>
-            </w:r>
-            <w:r>
-              <w:fldChar w:fldCharType="begin"/>
-            </w:r>
-            <w:r>
-              <w:instrText xml:space="preserve"> PAGEREF _Toc100001 \h </w:instrText>
-            </w:r>
-            <w:r>
-              <w:fldChar w:fldCharType="separate"/>
-            </w:r>
-            <w:r>
-              <w:t>1</w:t>
-            </w:r>
-            <w:r>
-              <w:fldChar w:fldCharType="end"/>
-            </w:r>
-          </w:hyperlink>
-        </w:p>
-        <w:p>
-          <w:pPr>
-            <w:pStyle w:val="11"/>
-            <w:ind w:left="360"/>
-            <w:tabs>
-              <w:tab w:val="right" w:leader="dot" w:pos="9026"/>
-            </w:tabs>
-            <w:spacing w:before="120" w:after="60"/>
-          </w:pPr>
-          <w:hyperlink w:anchor="_Toc100002" w:history="1">
-            <w:r>
-              <w:rPr>
-                <w:rStyle w:val="Hyperlink"/>
-              </w:rPr>
-              <w:t>2. Phạm vi và nguồn tài liệu</w:t>
-            </w:r>
-            <w:r>
-              <w:tab/>
-            </w:r>
-            <w:r>
-              <w:fldChar w:fldCharType="begin"/>
-            </w:r>
-            <w:r>
-              <w:instrText xml:space="preserve"> PAGEREF _Toc100002 \h </w:instrText>
-            </w:r>
-            <w:r>
-              <w:fldChar w:fldCharType="separate"/>
-            </w:r>
-            <w:r>
-              <w:t>1</w:t>
-            </w:r>
-            <w:r>
-              <w:fldChar w:fldCharType="end"/>
-            </w:r>
-          </w:hyperlink>
-        </w:p>
-        <w:p>
-          <w:pPr>
-            <w:pStyle w:val="11"/>
-            <w:ind w:left="360"/>
-            <w:tabs>
-              <w:tab w:val="right" w:leader="dot" w:pos="9026"/>
-            </w:tabs>
-            <w:spacing w:before="120" w:after="60"/>
-          </w:pPr>
-          <w:hyperlink w:anchor="_Toc100003" w:history="1">
-            <w:r>
-              <w:rPr>
-                <w:rStyle w:val="Hyperlink"/>
-              </w:rPr>
-              <w:t>3. Phương pháp trình bày</w:t>
-            </w:r>
-            <w:r>
-              <w:tab/>
-            </w:r>
-            <w:r>
-              <w:fldChar w:fldCharType="begin"/>
-            </w:r>
-            <w:r>
-              <w:instrText xml:space="preserve"> PAGEREF _Toc100003 \h </w:instrText>
-            </w:r>
-            <w:r>
-              <w:fldChar w:fldCharType="separate"/>
-            </w:r>
-            <w:r>
-              <w:t>1</w:t>
-            </w:r>
-            <w:r>
-              <w:fldChar w:fldCharType="end"/>
-            </w:r>
-          </w:hyperlink>
-        </w:p>
-        <w:p>
-          <w:pPr>
-            <w:pStyle w:val="9"/>
-            <w:tabs>
-              <w:tab w:val="right" w:leader="dot" w:pos="9026"/>
-            </w:tabs>
-            <w:spacing w:before="120" w:after="60"/>
-          </w:pPr>
-          <w:hyperlink w:anchor="_Toc100004" w:history="1">
-            <w:r>
-              <w:rPr>
-                <w:rStyle w:val="Hyperlink"/>
-              </w:rPr>
-              <w:t>PHẦN 1. NGỮ PHÁP CỐT LÕI THEO UNIT</w:t>
-            </w:r>
-            <w:r>
-              <w:tab/>
-            </w:r>
-            <w:r>
-              <w:fldChar w:fldCharType="begin"/>
-            </w:r>
-            <w:r>
-              <w:instrText xml:space="preserve"> PAGEREF _Toc100004 \h </w:instrText>
-            </w:r>
-            <w:r>
-              <w:fldChar w:fldCharType="separate"/>
-            </w:r>
-            <w:r>
-              <w:t>2</w:t>
-            </w:r>
-            <w:r>
-              <w:fldChar w:fldCharType="end"/>
-            </w:r>
-          </w:hyperlink>
-        </w:p>
-        <w:p>
-          <w:pPr>
-            <w:pStyle w:val="11"/>
-            <w:ind w:left="360"/>
-            <w:tabs>
-              <w:tab w:val="right" w:leader="dot" w:pos="9026"/>
-            </w:tabs>
-            <w:spacing w:before="120" w:after="60"/>
-          </w:pPr>
-          <w:hyperlink w:anchor="_Toc100005" w:history="1">
-            <w:r>
-              <w:rPr>
-                <w:rStyle w:val="Hyperlink"/>
-              </w:rPr>
-              <w:t>1.1. Nói giờ (Telling the time)</w:t>
-            </w:r>
-            <w:r>
-              <w:tab/>
-            </w:r>
-            <w:r>
-              <w:fldChar w:fldCharType="begin"/>
-            </w:r>
-            <w:r>
-              <w:instrText xml:space="preserve"> PAGEREF _Toc100005 \h </w:instrText>
-            </w:r>
-            <w:r>
-              <w:fldChar w:fldCharType="separate"/>
-            </w:r>
-            <w:r>
-              <w:t>2</w:t>
-            </w:r>
-            <w:r>
-              <w:fldChar w:fldCharType="end"/>
-            </w:r>
-          </w:hyperlink>
-        </w:p>
-        <w:p>
-          <w:pPr>
-            <w:pStyle w:val="11"/>
-            <w:ind w:left="360"/>
-            <w:tabs>
-              <w:tab w:val="right" w:leader="dot" w:pos="9026"/>
-            </w:tabs>
-            <w:spacing w:before="120" w:after="60"/>
-          </w:pPr>
-          <w:hyperlink w:anchor="_Toc100006" w:history="1">
-            <w:r>
-              <w:rPr>
-                <w:rStyle w:val="Hyperlink"/>
-              </w:rPr>
-              <w:t>1.2. Unit 1 – Lifestyle: Hiện tại đơn, trạng từ tần suất, hiện tại tiếp diễn</w:t>
-            </w:r>
-            <w:r>
-              <w:tab/>
-            </w:r>
-            <w:r>
-              <w:fldChar w:fldCharType="begin"/>
-            </w:r>
-            <w:r>
-              <w:instrText xml:space="preserve"> PAGEREF _Toc100006 \h </w:instrText>
-            </w:r>
-            <w:r>
-              <w:fldChar w:fldCharType="separate"/>
-            </w:r>
-            <w:r>
-              <w:t>2</w:t>
-            </w:r>
-            <w:r>
-              <w:fldChar w:fldCharType="end"/>
-            </w:r>
-          </w:hyperlink>
-        </w:p>
-        <w:p>
-          <w:pPr>
-            <w:pStyle w:val="12"/>
-            <w:ind w:left="720"/>
-            <w:tabs>
-              <w:tab w:val="right" w:leader="dot" w:pos="9026"/>
-            </w:tabs>
-            <w:spacing w:before="120" w:after="60"/>
-          </w:pPr>
-          <w:hyperlink w:anchor="_Toc100007" w:history="1">
-            <w:r>
-              <w:rPr>
-                <w:rStyle w:val="Hyperlink"/>
-              </w:rPr>
-              <w:t>a) Thì hiện tại đơn (Simple Present)</w:t>
-            </w:r>
-            <w:r>
-              <w:tab/>
-            </w:r>
-            <w:r>
-              <w:fldChar w:fldCharType="begin"/>
-            </w:r>
-            <w:r>
-              <w:instrText xml:space="preserve"> PAGEREF _Toc100007 \h </w:instrText>
-            </w:r>
-            <w:r>
-              <w:fldChar w:fldCharType="separate"/>
-            </w:r>
-            <w:r>
-              <w:t>2</w:t>
-            </w:r>
-            <w:r>
-              <w:fldChar w:fldCharType="end"/>
-            </w:r>
-          </w:hyperlink>
-        </w:p>
-        <w:p>
-          <w:pPr>
-            <w:pStyle w:val="12"/>
-            <w:ind w:left="720"/>
-            <w:tabs>
-              <w:tab w:val="right" w:leader="dot" w:pos="9026"/>
-            </w:tabs>
-            <w:spacing w:before="120" w:after="60"/>
-          </w:pPr>
-          <w:hyperlink w:anchor="_Toc100008" w:history="1">
-            <w:r>
-              <w:rPr>
-                <w:rStyle w:val="Hyperlink"/>
-              </w:rPr>
-              <w:t>b) Trạng từ tần suất (Adverbs of frequency)</w:t>
-            </w:r>
-            <w:r>
-              <w:tab/>
-            </w:r>
-            <w:r>
-              <w:fldChar w:fldCharType="begin"/>
-            </w:r>
-            <w:r>
-              <w:instrText xml:space="preserve"> PAGEREF _Toc100008 \h </w:instrText>
-            </w:r>
-            <w:r>
-              <w:fldChar w:fldCharType="separate"/>
-            </w:r>
-            <w:r>
-              <w:t>3</w:t>
-            </w:r>
-            <w:r>
-              <w:fldChar w:fldCharType="end"/>
-            </w:r>
-          </w:hyperlink>
-        </w:p>
-        <w:p>
-          <w:pPr>
-            <w:pStyle w:val="12"/>
-            <w:ind w:left="720"/>
-            <w:tabs>
-              <w:tab w:val="right" w:leader="dot" w:pos="9026"/>
-            </w:tabs>
-            <w:spacing w:before="120" w:after="60"/>
-          </w:pPr>
-          <w:hyperlink w:anchor="_Toc100009" w:history="1">
-            <w:r>
-              <w:rPr>
-                <w:rStyle w:val="Hyperlink"/>
-              </w:rPr>
-              <w:t>c) Thì hiện tại tiếp diễn (Present Continuous)</w:t>
-            </w:r>
-            <w:r>
-              <w:tab/>
-            </w:r>
-            <w:r>
-              <w:fldChar w:fldCharType="begin"/>
-            </w:r>
-            <w:r>
-              <w:instrText xml:space="preserve"> PAGEREF _Toc100009 \h </w:instrText>
-            </w:r>
-            <w:r>
-              <w:fldChar w:fldCharType="separate"/>
-            </w:r>
-            <w:r>
-              <w:t>3</w:t>
-            </w:r>
-            <w:r>
-              <w:fldChar w:fldCharType="end"/>
-            </w:r>
-          </w:hyperlink>
-        </w:p>
-        <w:p>
-          <w:pPr>
-            <w:pStyle w:val="11"/>
-            <w:ind w:left="360"/>
-            <w:tabs>
-              <w:tab w:val="right" w:leader="dot" w:pos="9026"/>
-            </w:tabs>
-            <w:spacing w:before="120" w:after="60"/>
-          </w:pPr>
-          <w:hyperlink w:anchor="_Toc100010" w:history="1">
-            <w:r>
-              <w:rPr>
-                <w:rStyle w:val="Hyperlink"/>
-              </w:rPr>
-              <w:t>1.3. Unit 2 – Competitions: V-ing và To-infinitive</w:t>
-            </w:r>
-            <w:r>
-              <w:tab/>
-            </w:r>
-            <w:r>
-              <w:fldChar w:fldCharType="begin"/>
-            </w:r>
-            <w:r>
-              <w:instrText xml:space="preserve"> PAGEREF _Toc100010 \h </w:instrText>
-            </w:r>
-            <w:r>
-              <w:fldChar w:fldCharType="separate"/>
-            </w:r>
-            <w:r>
-              <w:t>4</w:t>
-            </w:r>
-            <w:r>
-              <w:fldChar w:fldCharType="end"/>
-            </w:r>
-          </w:hyperlink>
-        </w:p>
-        <w:p>
-          <w:pPr>
-            <w:pStyle w:val="12"/>
-            <w:ind w:left="720"/>
-            <w:tabs>
-              <w:tab w:val="right" w:leader="dot" w:pos="9026"/>
-            </w:tabs>
-            <w:spacing w:before="120" w:after="60"/>
-          </w:pPr>
-          <w:hyperlink w:anchor="_Toc100011" w:history="1">
-            <w:r>
-              <w:rPr>
-                <w:rStyle w:val="Hyperlink"/>
-              </w:rPr>
-              <w:t>a) V-ing làm chủ ngữ, tân ngữ, sau giới từ</w:t>
-            </w:r>
-            <w:r>
-              <w:tab/>
-            </w:r>
-            <w:r>
-              <w:fldChar w:fldCharType="begin"/>
-            </w:r>
-            <w:r>
-              <w:instrText xml:space="preserve"> PAGEREF _Toc100011 \h </w:instrText>
-            </w:r>
-            <w:r>
-              <w:fldChar w:fldCharType="separate"/>
-            </w:r>
-            <w:r>
-              <w:t>4</w:t>
-            </w:r>
-            <w:r>
-              <w:fldChar w:fldCharType="end"/>
-            </w:r>
-          </w:hyperlink>
-        </w:p>
-        <w:p>
-          <w:pPr>
-            <w:pStyle w:val="12"/>
-            <w:ind w:left="720"/>
-            <w:tabs>
-              <w:tab w:val="right" w:leader="dot" w:pos="9026"/>
-            </w:tabs>
-            <w:spacing w:before="120" w:after="60"/>
-          </w:pPr>
-          <w:hyperlink w:anchor="_Toc100012" w:history="1">
-            <w:r>
-              <w:rPr>
-                <w:rStyle w:val="Hyperlink"/>
-              </w:rPr>
-              <w:t>b) Động từ + to-infinitive</w:t>
-            </w:r>
-            <w:r>
-              <w:tab/>
-            </w:r>
-            <w:r>
-              <w:fldChar w:fldCharType="begin"/>
-            </w:r>
-            <w:r>
-              <w:instrText xml:space="preserve"> PAGEREF _Toc100012 \h </w:instrText>
-            </w:r>
-            <w:r>
-              <w:fldChar w:fldCharType="separate"/>
-            </w:r>
-            <w:r>
-              <w:t>4</w:t>
-            </w:r>
-            <w:r>
-              <w:fldChar w:fldCharType="end"/>
-            </w:r>
-          </w:hyperlink>
-        </w:p>
-        <w:p>
-          <w:pPr>
-            <w:pStyle w:val="12"/>
-            <w:ind w:left="720"/>
-            <w:tabs>
-              <w:tab w:val="right" w:leader="dot" w:pos="9026"/>
-            </w:tabs>
-            <w:spacing w:before="120" w:after="60"/>
-          </w:pPr>
-          <w:hyperlink w:anchor="_Toc100013" w:history="1">
-            <w:r>
-              <w:rPr>
-                <w:rStyle w:val="Hyperlink"/>
-              </w:rPr>
-              <w:t>c) V-ing hay to-inf? (các cặp đổi nghĩa)</w:t>
-            </w:r>
-            <w:r>
-              <w:tab/>
-            </w:r>
-            <w:r>
-              <w:fldChar w:fldCharType="begin"/>
-            </w:r>
-            <w:r>
-              <w:instrText xml:space="preserve"> PAGEREF _Toc100013 \h </w:instrText>
-            </w:r>
-            <w:r>
-              <w:fldChar w:fldCharType="separate"/>
-            </w:r>
-            <w:r>
-              <w:t>4</w:t>
-            </w:r>
-            <w:r>
-              <w:fldChar w:fldCharType="end"/>
-            </w:r>
-          </w:hyperlink>
-        </w:p>
-        <w:p>
-          <w:pPr>
-            <w:pStyle w:val="11"/>
-            <w:ind w:left="360"/>
-            <w:tabs>
-              <w:tab w:val="right" w:leader="dot" w:pos="9026"/>
-            </w:tabs>
-            <w:spacing w:before="120" w:after="60"/>
-          </w:pPr>
-          <w:hyperlink w:anchor="_Toc100014" w:history="1">
-            <w:r>
-              <w:rPr>
-                <w:rStyle w:val="Hyperlink"/>
-              </w:rPr>
-              <w:t>1.4. Động từ khiếm khuyết (Modal verbs)</w:t>
-            </w:r>
-            <w:r>
-              <w:tab/>
-            </w:r>
-            <w:r>
-              <w:fldChar w:fldCharType="begin"/>
-            </w:r>
-            <w:r>
-              <w:instrText xml:space="preserve"> PAGEREF _Toc100014 \h </w:instrText>
-            </w:r>
-            <w:r>
-              <w:fldChar w:fldCharType="separate"/>
-            </w:r>
-            <w:r>
-              <w:t>5</w:t>
-            </w:r>
-            <w:r>
-              <w:fldChar w:fldCharType="end"/>
-            </w:r>
-          </w:hyperlink>
-        </w:p>
-        <w:p>
-          <w:pPr>
-            <w:pStyle w:val="11"/>
-            <w:ind w:left="360"/>
-            <w:tabs>
-              <w:tab w:val="right" w:leader="dot" w:pos="9026"/>
-            </w:tabs>
-            <w:spacing w:before="120" w:after="60"/>
-          </w:pPr>
-          <w:hyperlink w:anchor="_Toc100015" w:history="1">
-            <w:r>
-              <w:rPr>
-                <w:rStyle w:val="Hyperlink"/>
-              </w:rPr>
-              <w:t>1.5. Unit 3 – Transport: So sánh (Comparisons)</w:t>
-            </w:r>
-            <w:r>
-              <w:tab/>
-            </w:r>
-            <w:r>
-              <w:fldChar w:fldCharType="begin"/>
-            </w:r>
-            <w:r>
-              <w:instrText xml:space="preserve"> PAGEREF _Toc100015 \h </w:instrText>
-            </w:r>
-            <w:r>
-              <w:fldChar w:fldCharType="separate"/>
-            </w:r>
-            <w:r>
-              <w:t>6</w:t>
-            </w:r>
-            <w:r>
-              <w:fldChar w:fldCharType="end"/>
-            </w:r>
-          </w:hyperlink>
-        </w:p>
-        <w:p>
-          <w:pPr>
-            <w:pStyle w:val="12"/>
-            <w:ind w:left="720"/>
-            <w:tabs>
-              <w:tab w:val="right" w:leader="dot" w:pos="9026"/>
-            </w:tabs>
-            <w:spacing w:before="120" w:after="60"/>
-          </w:pPr>
-          <w:hyperlink w:anchor="_Toc100016" w:history="1">
-            <w:r>
-              <w:rPr>
-                <w:rStyle w:val="Hyperlink"/>
-              </w:rPr>
-              <w:t>a) So sánh bằng / không bằng</w:t>
-            </w:r>
-            <w:r>
-              <w:tab/>
-            </w:r>
-            <w:r>
-              <w:fldChar w:fldCharType="begin"/>
-            </w:r>
-            <w:r>
-              <w:instrText xml:space="preserve"> PAGEREF _Toc100016 \h </w:instrText>
-            </w:r>
-            <w:r>
-              <w:fldChar w:fldCharType="separate"/>
-            </w:r>
-            <w:r>
-              <w:t>6</w:t>
-            </w:r>
-            <w:r>
-              <w:fldChar w:fldCharType="end"/>
-            </w:r>
-          </w:hyperlink>
-        </w:p>
-        <w:p>
-          <w:pPr>
-            <w:pStyle w:val="12"/>
-            <w:ind w:left="720"/>
-            <w:tabs>
-              <w:tab w:val="right" w:leader="dot" w:pos="9026"/>
-            </w:tabs>
-            <w:spacing w:before="120" w:after="60"/>
-          </w:pPr>
-          <w:hyperlink w:anchor="_Toc100017" w:history="1">
-            <w:r>
-              <w:rPr>
-                <w:rStyle w:val="Hyperlink"/>
-              </w:rPr>
-              <w:t>b) Tính từ / trạng từ ngắn và dài</w:t>
-            </w:r>
-            <w:r>
-              <w:tab/>
-            </w:r>
-            <w:r>
-              <w:fldChar w:fldCharType="begin"/>
-            </w:r>
-            <w:r>
-              <w:instrText xml:space="preserve"> PAGEREF _Toc100017 \h </w:instrText>
-            </w:r>
-            <w:r>
-              <w:fldChar w:fldCharType="separate"/>
-            </w:r>
-            <w:r>
-              <w:t>6</w:t>
-            </w:r>
-            <w:r>
-              <w:fldChar w:fldCharType="end"/>
-            </w:r>
-          </w:hyperlink>
-        </w:p>
-        <w:p>
-          <w:pPr>
-            <w:pStyle w:val="12"/>
-            <w:ind w:left="720"/>
-            <w:tabs>
-              <w:tab w:val="right" w:leader="dot" w:pos="9026"/>
-            </w:tabs>
-            <w:spacing w:before="120" w:after="60"/>
-          </w:pPr>
-          <w:hyperlink w:anchor="_Toc100018" w:history="1">
-            <w:r>
-              <w:rPr>
-                <w:rStyle w:val="Hyperlink"/>
-              </w:rPr>
-              <w:t>c) So sánh hơn (Comparative)</w:t>
-            </w:r>
-            <w:r>
-              <w:tab/>
-            </w:r>
-            <w:r>
-              <w:fldChar w:fldCharType="begin"/>
-            </w:r>
-            <w:r>
-              <w:instrText xml:space="preserve"> PAGEREF _Toc100018 \h </w:instrText>
-            </w:r>
-            <w:r>
-              <w:fldChar w:fldCharType="separate"/>
-            </w:r>
-            <w:r>
-              <w:t>6</w:t>
-            </w:r>
-            <w:r>
-              <w:fldChar w:fldCharType="end"/>
-            </w:r>
-          </w:hyperlink>
-        </w:p>
-        <w:p>
-          <w:pPr>
-            <w:pStyle w:val="12"/>
-            <w:ind w:left="720"/>
-            <w:tabs>
-              <w:tab w:val="right" w:leader="dot" w:pos="9026"/>
-            </w:tabs>
-            <w:spacing w:before="120" w:after="60"/>
-          </w:pPr>
-          <w:hyperlink w:anchor="_Toc100019" w:history="1">
-            <w:r>
-              <w:rPr>
-                <w:rStyle w:val="Hyperlink"/>
-              </w:rPr>
-              <w:t>d) So sánh nhất (Superlative)</w:t>
-            </w:r>
-            <w:r>
-              <w:tab/>
-            </w:r>
-            <w:r>
-              <w:fldChar w:fldCharType="begin"/>
-            </w:r>
-            <w:r>
-              <w:instrText xml:space="preserve"> PAGEREF _Toc100019 \h </w:instrText>
-            </w:r>
-            <w:r>
-              <w:fldChar w:fldCharType="separate"/>
-            </w:r>
-            <w:r>
-              <w:t>7</w:t>
-            </w:r>
-            <w:r>
-              <w:fldChar w:fldCharType="end"/>
-            </w:r>
-          </w:hyperlink>
-        </w:p>
-        <w:p>
-          <w:pPr>
-            <w:pStyle w:val="11"/>
-            <w:ind w:left="360"/>
-            <w:tabs>
-              <w:tab w:val="right" w:leader="dot" w:pos="9026"/>
-            </w:tabs>
-            <w:spacing w:before="120" w:after="60"/>
-          </w:pPr>
-          <w:hyperlink w:anchor="_Toc100020" w:history="1">
-            <w:r>
-              <w:rPr>
-                <w:rStyle w:val="Hyperlink"/>
-              </w:rPr>
-              <w:t>1.6. Unit 4 – Challenges: Quá khứ đơn và quá khứ tiếp diễn</w:t>
-            </w:r>
-            <w:r>
-              <w:tab/>
-            </w:r>
-            <w:r>
-              <w:fldChar w:fldCharType="begin"/>
-            </w:r>
-            <w:r>
-              <w:instrText xml:space="preserve"> PAGEREF _Toc100020 \h </w:instrText>
-            </w:r>
-            <w:r>
-              <w:fldChar w:fldCharType="separate"/>
-            </w:r>
-            <w:r>
-              <w:t>7</w:t>
-            </w:r>
-            <w:r>
-              <w:fldChar w:fldCharType="end"/>
-            </w:r>
-          </w:hyperlink>
-        </w:p>
-        <w:p>
-          <w:pPr>
-            <w:pStyle w:val="12"/>
-            <w:ind w:left="720"/>
-            <w:tabs>
-              <w:tab w:val="right" w:leader="dot" w:pos="9026"/>
-            </w:tabs>
-            <w:spacing w:before="120" w:after="60"/>
-          </w:pPr>
-          <w:hyperlink w:anchor="_Toc100021" w:history="1">
-            <w:r>
-              <w:rPr>
-                <w:rStyle w:val="Hyperlink"/>
-              </w:rPr>
-              <w:t>a) Thì quá khứ đơn (Simple Past)</w:t>
-            </w:r>
-            <w:r>
-              <w:tab/>
-            </w:r>
-            <w:r>
-              <w:fldChar w:fldCharType="begin"/>
-            </w:r>
-            <w:r>
-              <w:instrText xml:space="preserve"> PAGEREF _Toc100021 \h </w:instrText>
-            </w:r>
-            <w:r>
-              <w:fldChar w:fldCharType="separate"/>
-            </w:r>
-            <w:r>
-              <w:t>7</w:t>
-            </w:r>
-            <w:r>
-              <w:fldChar w:fldCharType="end"/>
-            </w:r>
-          </w:hyperlink>
-        </w:p>
-        <w:p>
-          <w:pPr>
-            <w:pStyle w:val="12"/>
-            <w:ind w:left="720"/>
-            <w:tabs>
-              <w:tab w:val="right" w:leader="dot" w:pos="9026"/>
-            </w:tabs>
-            <w:spacing w:before="120" w:after="60"/>
-          </w:pPr>
-          <w:hyperlink w:anchor="_Toc100022" w:history="1">
-            <w:r>
-              <w:rPr>
-                <w:rStyle w:val="Hyperlink"/>
-              </w:rPr>
-              <w:t>b) Quy tắc thêm -ed (V-ed của động từ có quy tắc)</w:t>
-            </w:r>
-            <w:r>
-              <w:tab/>
-            </w:r>
-            <w:r>
-              <w:fldChar w:fldCharType="begin"/>
-            </w:r>
-            <w:r>
-              <w:instrText xml:space="preserve"> PAGEREF _Toc100022 \h </w:instrText>
-            </w:r>
-            <w:r>
-              <w:fldChar w:fldCharType="separate"/>
-            </w:r>
-            <w:r>
-              <w:t>7</w:t>
-            </w:r>
-            <w:r>
-              <w:fldChar w:fldCharType="end"/>
-            </w:r>
-          </w:hyperlink>
-        </w:p>
-        <w:p>
-          <w:pPr>
-            <w:pStyle w:val="12"/>
-            <w:ind w:left="720"/>
-            <w:tabs>
-              <w:tab w:val="right" w:leader="dot" w:pos="9026"/>
-            </w:tabs>
-            <w:spacing w:before="120" w:after="60"/>
-          </w:pPr>
-          <w:hyperlink w:anchor="_Toc100023" w:history="1">
-            <w:r>
-              <w:rPr>
-                <w:rStyle w:val="Hyperlink"/>
-              </w:rPr>
-              <w:t>c) Cách đọc đuôi -ed (3 âm) — hay ra đề phát âm</w:t>
-            </w:r>
-            <w:r>
-              <w:tab/>
-            </w:r>
-            <w:r>
-              <w:fldChar w:fldCharType="begin"/>
-            </w:r>
-            <w:r>
-              <w:instrText xml:space="preserve"> PAGEREF _Toc100023 \h </w:instrText>
-            </w:r>
-            <w:r>
-              <w:fldChar w:fldCharType="separate"/>
-            </w:r>
-            <w:r>
-              <w:t>8</w:t>
-            </w:r>
-            <w:r>
-              <w:fldChar w:fldCharType="end"/>
-            </w:r>
-          </w:hyperlink>
-        </w:p>
-        <w:p>
-          <w:pPr>
-            <w:pStyle w:val="12"/>
-            <w:ind w:left="720"/>
-            <w:tabs>
-              <w:tab w:val="right" w:leader="dot" w:pos="9026"/>
-            </w:tabs>
-            <w:spacing w:before="120" w:after="60"/>
-          </w:pPr>
-          <w:hyperlink w:anchor="_Toc100024" w:history="1">
-            <w:r>
-              <w:rPr>
-                <w:rStyle w:val="Hyperlink"/>
-              </w:rPr>
-              <w:t>d) Động từ bất quy tắc (V2) — nhóm theo slide</w:t>
-            </w:r>
-            <w:r>
-              <w:tab/>
-            </w:r>
-            <w:r>
-              <w:fldChar w:fldCharType="begin"/>
-            </w:r>
-            <w:r>
-              <w:instrText xml:space="preserve"> PAGEREF _Toc100024 \h </w:instrText>
-            </w:r>
-            <w:r>
-              <w:fldChar w:fldCharType="separate"/>
-            </w:r>
-            <w:r>
-              <w:t>8</w:t>
-            </w:r>
-            <w:r>
-              <w:fldChar w:fldCharType="end"/>
-            </w:r>
-          </w:hyperlink>
-        </w:p>
-        <w:p>
-          <w:pPr>
-            <w:pStyle w:val="12"/>
-            <w:ind w:left="720"/>
-            <w:tabs>
-              <w:tab w:val="right" w:leader="dot" w:pos="9026"/>
-            </w:tabs>
-            <w:spacing w:before="120" w:after="60"/>
-          </w:pPr>
-          <w:hyperlink w:anchor="_Toc100025" w:history="1">
-            <w:r>
-              <w:rPr>
-                <w:rStyle w:val="Hyperlink"/>
-              </w:rPr>
-              <w:t>e) Thì quá khứ tiếp diễn (Past Continuous)</w:t>
-            </w:r>
-            <w:r>
-              <w:tab/>
-            </w:r>
-            <w:r>
-              <w:fldChar w:fldCharType="begin"/>
-            </w:r>
-            <w:r>
-              <w:instrText xml:space="preserve"> PAGEREF _Toc100025 \h </w:instrText>
-            </w:r>
-            <w:r>
-              <w:fldChar w:fldCharType="separate"/>
-            </w:r>
-            <w:r>
-              <w:t>8</w:t>
-            </w:r>
-            <w:r>
-              <w:fldChar w:fldCharType="end"/>
-            </w:r>
-          </w:hyperlink>
-        </w:p>
-        <w:p>
-          <w:pPr>
-            <w:pStyle w:val="11"/>
-            <w:ind w:left="360"/>
-            <w:tabs>
-              <w:tab w:val="right" w:leader="dot" w:pos="9026"/>
-            </w:tabs>
-            <w:spacing w:before="120" w:after="60"/>
-          </w:pPr>
-          <w:hyperlink w:anchor="_Toc100026" w:history="1">
-            <w:r>
-              <w:rPr>
-                <w:rStyle w:val="Hyperlink"/>
-              </w:rPr>
-              <w:t>1.7. Unit 5 – Environment: Danh từ, lượng từ, mạo từ, made of/from</w:t>
-            </w:r>
-            <w:r>
-              <w:tab/>
-            </w:r>
-            <w:r>
-              <w:fldChar w:fldCharType="begin"/>
-            </w:r>
-            <w:r>
-              <w:instrText xml:space="preserve"> PAGEREF _Toc100026 \h </w:instrText>
-            </w:r>
-            <w:r>
-              <w:fldChar w:fldCharType="separate"/>
-            </w:r>
-            <w:r>
-              <w:t>9</w:t>
-            </w:r>
-            <w:r>
-              <w:fldChar w:fldCharType="end"/>
-            </w:r>
-          </w:hyperlink>
-        </w:p>
-        <w:p>
-          <w:pPr>
-            <w:pStyle w:val="12"/>
-            <w:ind w:left="720"/>
-            <w:tabs>
-              <w:tab w:val="right" w:leader="dot" w:pos="9026"/>
-            </w:tabs>
-            <w:spacing w:before="120" w:after="60"/>
-          </w:pPr>
-          <w:hyperlink w:anchor="_Toc100027" w:history="1">
-            <w:r>
-              <w:rPr>
-                <w:rStyle w:val="Hyperlink"/>
-              </w:rPr>
-              <w:t>a) Danh từ đếm được và không đếm được</w:t>
-            </w:r>
-            <w:r>
-              <w:tab/>
-            </w:r>
-            <w:r>
-              <w:fldChar w:fldCharType="begin"/>
-            </w:r>
-            <w:r>
-              <w:instrText xml:space="preserve"> PAGEREF _Toc100027 \h </w:instrText>
-            </w:r>
-            <w:r>
-              <w:fldChar w:fldCharType="separate"/>
-            </w:r>
-            <w:r>
-              <w:t>9</w:t>
-            </w:r>
-            <w:r>
-              <w:fldChar w:fldCharType="end"/>
-            </w:r>
-          </w:hyperlink>
-        </w:p>
-        <w:p>
-          <w:pPr>
-            <w:pStyle w:val="12"/>
-            <w:ind w:left="720"/>
-            <w:tabs>
-              <w:tab w:val="right" w:leader="dot" w:pos="9026"/>
-            </w:tabs>
-            <w:spacing w:before="120" w:after="60"/>
-          </w:pPr>
-          <w:hyperlink w:anchor="_Toc100028" w:history="1">
-            <w:r>
-              <w:rPr>
-                <w:rStyle w:val="Hyperlink"/>
-              </w:rPr>
-              <w:t>b) Made of / made from / made by / made in</w:t>
-            </w:r>
-            <w:r>
-              <w:tab/>
-            </w:r>
-            <w:r>
-              <w:fldChar w:fldCharType="begin"/>
-            </w:r>
-            <w:r>
-              <w:instrText xml:space="preserve"> PAGEREF _Toc100028 \h </w:instrText>
-            </w:r>
-            <w:r>
-              <w:fldChar w:fldCharType="separate"/>
-            </w:r>
-            <w:r>
-              <w:t>9</w:t>
-            </w:r>
-            <w:r>
-              <w:fldChar w:fldCharType="end"/>
-            </w:r>
-          </w:hyperlink>
-        </w:p>
-        <w:p>
-          <w:pPr>
-            <w:pStyle w:val="12"/>
-            <w:ind w:left="720"/>
-            <w:tabs>
-              <w:tab w:val="right" w:leader="dot" w:pos="9026"/>
-            </w:tabs>
-            <w:spacing w:before="120" w:after="60"/>
-          </w:pPr>
-          <w:hyperlink w:anchor="_Toc100029" w:history="1">
-            <w:r>
-              <w:rPr>
-                <w:rStyle w:val="Hyperlink"/>
-              </w:rPr>
-              <w:t>c) Much, many, (a) little, (a) few, how much, how many</w:t>
-            </w:r>
-            <w:r>
-              <w:tab/>
-            </w:r>
-            <w:r>
-              <w:fldChar w:fldCharType="begin"/>
-            </w:r>
-            <w:r>
-              <w:instrText xml:space="preserve"> PAGEREF _Toc100029 \h </w:instrText>
-            </w:r>
-            <w:r>
-              <w:fldChar w:fldCharType="separate"/>
-            </w:r>
-            <w:r>
-              <w:t>9</w:t>
-            </w:r>
-            <w:r>
-              <w:fldChar w:fldCharType="end"/>
-            </w:r>
-          </w:hyperlink>
-        </w:p>
-        <w:p>
-          <w:pPr>
-            <w:pStyle w:val="12"/>
-            <w:ind w:left="720"/>
-            <w:tabs>
-              <w:tab w:val="right" w:leader="dot" w:pos="9026"/>
-            </w:tabs>
-            <w:spacing w:before="120" w:after="60"/>
-          </w:pPr>
-          <w:hyperlink w:anchor="_Toc100030" w:history="1">
-            <w:r>
-              <w:rPr>
-                <w:rStyle w:val="Hyperlink"/>
-              </w:rPr>
-              <w:t>d) Some / any / no / enough</w:t>
-            </w:r>
-            <w:r>
-              <w:tab/>
-            </w:r>
-            <w:r>
-              <w:fldChar w:fldCharType="begin"/>
-            </w:r>
-            <w:r>
-              <w:instrText xml:space="preserve"> PAGEREF _Toc100030 \h </w:instrText>
-            </w:r>
-            <w:r>
-              <w:fldChar w:fldCharType="separate"/>
-            </w:r>
-            <w:r>
-              <w:t>9</w:t>
-            </w:r>
-            <w:r>
-              <w:fldChar w:fldCharType="end"/>
-            </w:r>
-          </w:hyperlink>
-        </w:p>
-        <w:p>
-          <w:pPr>
-            <w:pStyle w:val="12"/>
-            <w:ind w:left="720"/>
-            <w:tabs>
-              <w:tab w:val="right" w:leader="dot" w:pos="9026"/>
-            </w:tabs>
-            <w:spacing w:before="120" w:after="60"/>
-          </w:pPr>
-          <w:hyperlink w:anchor="_Toc100031" w:history="1">
-            <w:r>
-              <w:rPr>
-                <w:rStyle w:val="Hyperlink"/>
-              </w:rPr>
-              <w:t>e) Mạo từ A / An / The / không dùng mạo từ</w:t>
-            </w:r>
-            <w:r>
-              <w:tab/>
-            </w:r>
-            <w:r>
-              <w:fldChar w:fldCharType="begin"/>
-            </w:r>
-            <w:r>
-              <w:instrText xml:space="preserve"> PAGEREF _Toc100031 \h </w:instrText>
-            </w:r>
-            <w:r>
-              <w:fldChar w:fldCharType="separate"/>
-            </w:r>
-            <w:r>
-              <w:t>9</w:t>
-            </w:r>
-            <w:r>
-              <w:fldChar w:fldCharType="end"/>
-            </w:r>
-          </w:hyperlink>
-        </w:p>
-        <w:p>
-          <w:pPr>
-            <w:pStyle w:val="11"/>
-            <w:ind w:left="360"/>
-            <w:tabs>
-              <w:tab w:val="right" w:leader="dot" w:pos="9026"/>
-            </w:tabs>
-            <w:spacing w:before="120" w:after="60"/>
-          </w:pPr>
-          <w:hyperlink w:anchor="_Toc100032" w:history="1">
-            <w:r>
-              <w:rPr>
-                <w:rStyle w:val="Hyperlink"/>
-              </w:rPr>
-              <w:t>1.8. Unit 6 – Stages in Life: To-infinitive và các thì tương lai</w:t>
-            </w:r>
-            <w:r>
-              <w:tab/>
-            </w:r>
-            <w:r>
-              <w:fldChar w:fldCharType="begin"/>
-            </w:r>
-            <w:r>
-              <w:instrText xml:space="preserve"> PAGEREF _Toc100032 \h </w:instrText>
-            </w:r>
-            <w:r>
-              <w:fldChar w:fldCharType="separate"/>
-            </w:r>
-            <w:r>
-              <w:t>10</w:t>
-            </w:r>
-            <w:r>
-              <w:fldChar w:fldCharType="end"/>
-            </w:r>
-          </w:hyperlink>
-        </w:p>
-        <w:p>
-          <w:pPr>
-            <w:pStyle w:val="12"/>
-            <w:ind w:left="720"/>
-            <w:tabs>
-              <w:tab w:val="right" w:leader="dot" w:pos="9026"/>
-            </w:tabs>
-            <w:spacing w:before="120" w:after="60"/>
-          </w:pPr>
-          <w:hyperlink w:anchor="_Toc100033" w:history="1">
-            <w:r>
-              <w:rPr>
-                <w:rStyle w:val="Hyperlink"/>
-              </w:rPr>
-              <w:t>a) Verb pattern with to-infinitive</w:t>
-            </w:r>
-            <w:r>
-              <w:tab/>
-            </w:r>
-            <w:r>
-              <w:fldChar w:fldCharType="begin"/>
-            </w:r>
-            <w:r>
-              <w:instrText xml:space="preserve"> PAGEREF _Toc100033 \h </w:instrText>
-            </w:r>
-            <w:r>
-              <w:fldChar w:fldCharType="separate"/>
-            </w:r>
-            <w:r>
-              <w:t>10</w:t>
-            </w:r>
-            <w:r>
-              <w:fldChar w:fldCharType="end"/>
-            </w:r>
-          </w:hyperlink>
-        </w:p>
-        <w:p>
-          <w:pPr>
-            <w:pStyle w:val="12"/>
-            <w:ind w:left="720"/>
-            <w:tabs>
-              <w:tab w:val="right" w:leader="dot" w:pos="9026"/>
-            </w:tabs>
-            <w:spacing w:before="120" w:after="60"/>
-          </w:pPr>
-          <w:hyperlink w:anchor="_Toc100034" w:history="1">
-            <w:r>
-              <w:rPr>
-                <w:rStyle w:val="Hyperlink"/>
-              </w:rPr>
-              <w:t>b) Các dạng thì tương lai (Future forms)</w:t>
-            </w:r>
-            <w:r>
-              <w:tab/>
-            </w:r>
-            <w:r>
-              <w:fldChar w:fldCharType="begin"/>
-            </w:r>
-            <w:r>
-              <w:instrText xml:space="preserve"> PAGEREF _Toc100034 \h </w:instrText>
-            </w:r>
-            <w:r>
-              <w:fldChar w:fldCharType="separate"/>
-            </w:r>
-            <w:r>
-              <w:t>11</w:t>
-            </w:r>
-            <w:r>
-              <w:fldChar w:fldCharType="end"/>
-            </w:r>
-          </w:hyperlink>
-        </w:p>
-        <w:p>
-          <w:pPr>
-            <w:pStyle w:val="11"/>
-            <w:ind w:left="360"/>
-            <w:tabs>
-              <w:tab w:val="right" w:leader="dot" w:pos="9026"/>
-            </w:tabs>
-            <w:spacing w:before="120" w:after="60"/>
-          </w:pPr>
-          <w:hyperlink w:anchor="_Toc100035" w:history="1">
-            <w:r>
-              <w:rPr>
-                <w:rStyle w:val="Hyperlink"/>
-              </w:rPr>
-              <w:t>1.9. Unit 7 – Work: Hiện tại hoàn thành (Present Perfect)</w:t>
-            </w:r>
-            <w:r>
-              <w:tab/>
-            </w:r>
-            <w:r>
-              <w:fldChar w:fldCharType="begin"/>
-            </w:r>
-            <w:r>
-              <w:instrText xml:space="preserve"> PAGEREF _Toc100035 \h </w:instrText>
-            </w:r>
-            <w:r>
-              <w:fldChar w:fldCharType="separate"/>
-            </w:r>
-            <w:r>
-              <w:t>11</w:t>
-            </w:r>
-            <w:r>
-              <w:fldChar w:fldCharType="end"/>
-            </w:r>
-          </w:hyperlink>
-        </w:p>
-        <w:p>
-          <w:pPr>
-            <w:pStyle w:val="12"/>
-            <w:ind w:left="720"/>
-            <w:tabs>
-              <w:tab w:val="right" w:leader="dot" w:pos="9026"/>
-            </w:tabs>
-            <w:spacing w:before="120" w:after="60"/>
-          </w:pPr>
-          <w:hyperlink w:anchor="_Toc100036" w:history="1">
-            <w:r>
-              <w:rPr>
-                <w:rStyle w:val="Hyperlink"/>
-              </w:rPr>
-              <w:t>a) Been và Gone</w:t>
-            </w:r>
-            <w:r>
-              <w:tab/>
-            </w:r>
-            <w:r>
-              <w:fldChar w:fldCharType="begin"/>
-            </w:r>
-            <w:r>
-              <w:instrText xml:space="preserve"> PAGEREF _Toc100036 \h </w:instrText>
-            </w:r>
-            <w:r>
-              <w:fldChar w:fldCharType="separate"/>
-            </w:r>
-            <w:r>
-              <w:t>12</w:t>
-            </w:r>
-            <w:r>
-              <w:fldChar w:fldCharType="end"/>
-            </w:r>
-          </w:hyperlink>
-        </w:p>
-        <w:p>
-          <w:pPr>
-            <w:pStyle w:val="12"/>
-            <w:ind w:left="720"/>
-            <w:tabs>
-              <w:tab w:val="right" w:leader="dot" w:pos="9026"/>
-            </w:tabs>
-            <w:spacing w:before="120" w:after="60"/>
-          </w:pPr>
-          <w:hyperlink w:anchor="_Toc100037" w:history="1">
-            <w:r>
-              <w:rPr>
-                <w:rStyle w:val="Hyperlink"/>
-              </w:rPr>
-              <w:t>b) Chuyển đổi câu: hiện tại hoàn thành ↔ quá khứ đơn (mẫu bất tử)</w:t>
-            </w:r>
-            <w:r>
-              <w:tab/>
-            </w:r>
-            <w:r>
-              <w:fldChar w:fldCharType="begin"/>
-            </w:r>
-            <w:r>
-              <w:instrText xml:space="preserve"> PAGEREF _Toc100037 \h </w:instrText>
-            </w:r>
-            <w:r>
-              <w:fldChar w:fldCharType="separate"/>
-            </w:r>
-            <w:r>
-              <w:t>12</w:t>
-            </w:r>
-            <w:r>
-              <w:fldChar w:fldCharType="end"/>
-            </w:r>
-          </w:hyperlink>
-        </w:p>
-        <w:p>
-          <w:pPr>
-            <w:pStyle w:val="11"/>
-            <w:ind w:left="360"/>
-            <w:tabs>
-              <w:tab w:val="right" w:leader="dot" w:pos="9026"/>
-            </w:tabs>
-            <w:spacing w:before="120" w:after="60"/>
-          </w:pPr>
-          <w:hyperlink w:anchor="_Toc100038" w:history="1">
-            <w:r>
-              <w:rPr>
-                <w:rStyle w:val="Hyperlink"/>
-              </w:rPr>
-              <w:t>1.10. Unit 8 – Technology: Mệnh đề quan hệ (Relative clauses)</w:t>
-            </w:r>
-            <w:r>
-              <w:tab/>
-            </w:r>
-            <w:r>
-              <w:fldChar w:fldCharType="begin"/>
-            </w:r>
-            <w:r>
-              <w:instrText xml:space="preserve"> PAGEREF _Toc100038 \h </w:instrText>
-            </w:r>
-            <w:r>
-              <w:fldChar w:fldCharType="separate"/>
-            </w:r>
-            <w:r>
-              <w:t>12</w:t>
-            </w:r>
-            <w:r>
-              <w:fldChar w:fldCharType="end"/>
-            </w:r>
-          </w:hyperlink>
-        </w:p>
-        <w:p>
-          <w:pPr>
-            <w:pStyle w:val="12"/>
-            <w:ind w:left="720"/>
-            <w:tabs>
-              <w:tab w:val="right" w:leader="dot" w:pos="9026"/>
-            </w:tabs>
-            <w:spacing w:before="120" w:after="60"/>
-          </w:pPr>
-          <w:hyperlink w:anchor="_Toc100039" w:history="1">
-            <w:r>
-              <w:rPr>
-                <w:rStyle w:val="Hyperlink"/>
-              </w:rPr>
-              <w:t>a) Đại từ quan hệ</w:t>
-            </w:r>
-            <w:r>
-              <w:tab/>
-            </w:r>
-            <w:r>
-              <w:fldChar w:fldCharType="begin"/>
-            </w:r>
-            <w:r>
-              <w:instrText xml:space="preserve"> PAGEREF _Toc100039 \h </w:instrText>
-            </w:r>
-            <w:r>
-              <w:fldChar w:fldCharType="separate"/>
-            </w:r>
-            <w:r>
-              <w:t>13</w:t>
-            </w:r>
-            <w:r>
-              <w:fldChar w:fldCharType="end"/>
-            </w:r>
-          </w:hyperlink>
-        </w:p>
-        <w:p>
-          <w:pPr>
-            <w:pStyle w:val="12"/>
-            <w:ind w:left="720"/>
-            <w:tabs>
-              <w:tab w:val="right" w:leader="dot" w:pos="9026"/>
-            </w:tabs>
-            <w:spacing w:before="120" w:after="60"/>
-          </w:pPr>
-          <w:hyperlink w:anchor="_Toc100040" w:history="1">
-            <w:r>
-              <w:rPr>
-                <w:rStyle w:val="Hyperlink"/>
-              </w:rPr>
-              <w:t>b) Trạng từ quan hệ</w:t>
-            </w:r>
-            <w:r>
-              <w:tab/>
-            </w:r>
-            <w:r>
-              <w:fldChar w:fldCharType="begin"/>
-            </w:r>
-            <w:r>
-              <w:instrText xml:space="preserve"> PAGEREF _Toc100040 \h </w:instrText>
-            </w:r>
-            <w:r>
-              <w:fldChar w:fldCharType="separate"/>
-            </w:r>
-            <w:r>
-              <w:t>13</w:t>
-            </w:r>
-            <w:r>
-              <w:fldChar w:fldCharType="end"/>
-            </w:r>
-          </w:hyperlink>
-        </w:p>
-        <w:p>
-          <w:pPr>
-            <w:pStyle w:val="12"/>
-            <w:ind w:left="720"/>
-            <w:tabs>
-              <w:tab w:val="right" w:leader="dot" w:pos="9026"/>
-            </w:tabs>
-            <w:spacing w:before="120" w:after="60"/>
-          </w:pPr>
-          <w:hyperlink w:anchor="_Toc100041" w:history="1">
-            <w:r>
-              <w:rPr>
-                <w:rStyle w:val="Hyperlink"/>
-              </w:rPr>
-              <w:t>c) Rút gọn và lược bỏ mệnh đề quan hệ</w:t>
-            </w:r>
-            <w:r>
-              <w:tab/>
-            </w:r>
-            <w:r>
-              <w:fldChar w:fldCharType="begin"/>
-            </w:r>
-            <w:r>
-              <w:instrText xml:space="preserve"> PAGEREF _Toc100041 \h </w:instrText>
-            </w:r>
-            <w:r>
-              <w:fldChar w:fldCharType="separate"/>
-            </w:r>
-            <w:r>
-              <w:t>13</w:t>
-            </w:r>
-            <w:r>
-              <w:fldChar w:fldCharType="end"/>
-            </w:r>
-          </w:hyperlink>
-        </w:p>
-        <w:p>
-          <w:pPr>
-            <w:pStyle w:val="11"/>
-            <w:ind w:left="360"/>
-            <w:tabs>
-              <w:tab w:val="right" w:leader="dot" w:pos="9026"/>
-            </w:tabs>
-            <w:spacing w:before="120" w:after="60"/>
-          </w:pPr>
-          <w:hyperlink w:anchor="_Toc100042" w:history="1">
-            <w:r>
-              <w:rPr>
-                <w:rStyle w:val="Hyperlink"/>
-              </w:rPr>
-              <w:t>1.11. Câu điều kiện loại 0 và loại 1</w:t>
-            </w:r>
-            <w:r>
-              <w:tab/>
-            </w:r>
-            <w:r>
-              <w:fldChar w:fldCharType="begin"/>
-            </w:r>
-            <w:r>
-              <w:instrText xml:space="preserve"> PAGEREF _Toc100042 \h </w:instrText>
-            </w:r>
-            <w:r>
-              <w:fldChar w:fldCharType="separate"/>
-            </w:r>
-            <w:r>
-              <w:t>14</w:t>
-            </w:r>
-            <w:r>
-              <w:fldChar w:fldCharType="end"/>
-            </w:r>
-          </w:hyperlink>
-        </w:p>
-        <w:p>
-          <w:pPr>
-            <w:pStyle w:val="12"/>
-            <w:ind w:left="720"/>
-            <w:tabs>
-              <w:tab w:val="right" w:leader="dot" w:pos="9026"/>
-            </w:tabs>
-            <w:spacing w:before="120" w:after="60"/>
-          </w:pPr>
-          <w:hyperlink w:anchor="_Toc100043" w:history="1">
-            <w:r>
-              <w:rPr>
-                <w:rStyle w:val="Hyperlink"/>
-              </w:rPr>
-              <w:t>a) Loại 0 — sự thật hiển nhiên, quy luật khoa học</w:t>
-            </w:r>
-            <w:r>
-              <w:tab/>
-            </w:r>
-            <w:r>
-              <w:fldChar w:fldCharType="begin"/>
-            </w:r>
-            <w:r>
-              <w:instrText xml:space="preserve"> PAGEREF _Toc100043 \h </w:instrText>
-            </w:r>
-            <w:r>
-              <w:fldChar w:fldCharType="separate"/>
-            </w:r>
-            <w:r>
-              <w:t>14</w:t>
-            </w:r>
-            <w:r>
-              <w:fldChar w:fldCharType="end"/>
-            </w:r>
-          </w:hyperlink>
-        </w:p>
-        <w:p>
-          <w:pPr>
-            <w:pStyle w:val="12"/>
-            <w:ind w:left="720"/>
-            <w:tabs>
-              <w:tab w:val="right" w:leader="dot" w:pos="9026"/>
-            </w:tabs>
-            <w:spacing w:before="120" w:after="60"/>
-          </w:pPr>
-          <w:hyperlink w:anchor="_Toc100044" w:history="1">
-            <w:r>
-              <w:rPr>
-                <w:rStyle w:val="Hyperlink"/>
-              </w:rPr>
-              <w:t>b) Loại 1 — có thể xảy ra ở hiện tại hoặc tương lai</w:t>
-            </w:r>
-            <w:r>
-              <w:tab/>
-            </w:r>
-            <w:r>
-              <w:fldChar w:fldCharType="begin"/>
-            </w:r>
-            <w:r>
-              <w:instrText xml:space="preserve"> PAGEREF _Toc100044 \h </w:instrText>
-            </w:r>
-            <w:r>
-              <w:fldChar w:fldCharType="separate"/>
-            </w:r>
-            <w:r>
-              <w:t>14</w:t>
-            </w:r>
-            <w:r>
-              <w:fldChar w:fldCharType="end"/>
-            </w:r>
-          </w:hyperlink>
-        </w:p>
-        <w:p>
-          <w:pPr>
-            <w:pStyle w:val="11"/>
-            <w:ind w:left="360"/>
-            <w:tabs>
-              <w:tab w:val="right" w:leader="dot" w:pos="9026"/>
-            </w:tabs>
-            <w:spacing w:before="120" w:after="60"/>
-          </w:pPr>
-          <w:hyperlink w:anchor="_Toc100045" w:history="1">
-            <w:r>
-              <w:rPr>
-                <w:rStyle w:val="Hyperlink"/>
-              </w:rPr>
-              <w:t>1.12. Unit 9 – Holidays: Quá khứ hoàn thành (Past Perfect)</w:t>
-            </w:r>
-            <w:r>
-              <w:tab/>
-            </w:r>
-            <w:r>
-              <w:fldChar w:fldCharType="begin"/>
-            </w:r>
-            <w:r>
-              <w:instrText xml:space="preserve"> PAGEREF _Toc100045 \h </w:instrText>
-            </w:r>
-            <w:r>
-              <w:fldChar w:fldCharType="separate"/>
-            </w:r>
-            <w:r>
-              <w:t>14</w:t>
-            </w:r>
-            <w:r>
-              <w:fldChar w:fldCharType="end"/>
-            </w:r>
-          </w:hyperlink>
-        </w:p>
-        <w:p>
-          <w:pPr>
-            <w:pStyle w:val="11"/>
-            <w:ind w:left="360"/>
-            <w:tabs>
-              <w:tab w:val="right" w:leader="dot" w:pos="9026"/>
-            </w:tabs>
-            <w:spacing w:before="120" w:after="60"/>
-          </w:pPr>
-          <w:hyperlink w:anchor="_Toc100046" w:history="1">
-            <w:r>
-              <w:rPr>
-                <w:rStyle w:val="Hyperlink"/>
-              </w:rPr>
-              <w:t>1.13. Unit 10 – Products: Câu bị động (The passive)</w:t>
-            </w:r>
-            <w:r>
-              <w:tab/>
-            </w:r>
-            <w:r>
-              <w:fldChar w:fldCharType="begin"/>
-            </w:r>
-            <w:r>
-              <w:instrText xml:space="preserve"> PAGEREF _Toc100046 \h </w:instrText>
-            </w:r>
-            <w:r>
-              <w:fldChar w:fldCharType="separate"/>
-            </w:r>
-            <w:r>
-              <w:t>14</w:t>
-            </w:r>
-            <w:r>
-              <w:fldChar w:fldCharType="end"/>
-            </w:r>
-          </w:hyperlink>
-        </w:p>
-        <w:p>
-          <w:pPr>
-            <w:pStyle w:val="9"/>
-            <w:tabs>
-              <w:tab w:val="right" w:leader="dot" w:pos="9026"/>
-            </w:tabs>
-            <w:spacing w:before="120" w:after="60"/>
-          </w:pPr>
-          <w:hyperlink w:anchor="_Toc100047" w:history="1">
-            <w:r>
-              <w:rPr>
-                <w:rStyle w:val="Hyperlink"/>
-              </w:rPr>
-              <w:t>PHẦN 2. VIẾT EMAIL THÂN MẬT (35–45 TỪ)</w:t>
-            </w:r>
-            <w:r>
-              <w:tab/>
-            </w:r>
-            <w:r>
-              <w:fldChar w:fldCharType="begin"/>
-            </w:r>
-            <w:r>
-              <w:instrText xml:space="preserve"> PAGEREF _Toc100047 \h </w:instrText>
-            </w:r>
-            <w:r>
-              <w:fldChar w:fldCharType="separate"/>
-            </w:r>
-            <w:r>
-              <w:t>15</w:t>
-            </w:r>
-            <w:r>
-              <w:fldChar w:fldCharType="end"/>
-            </w:r>
-          </w:hyperlink>
-        </w:p>
-        <w:p>
-          <w:pPr>
-            <w:pStyle w:val="11"/>
-            <w:ind w:left="360"/>
-            <w:tabs>
-              <w:tab w:val="right" w:leader="dot" w:pos="9026"/>
-            </w:tabs>
-            <w:spacing w:before="120" w:after="60"/>
-          </w:pPr>
-          <w:hyperlink w:anchor="_Toc100048" w:history="1">
-            <w:r>
-              <w:rPr>
-                <w:rStyle w:val="Hyperlink"/>
-              </w:rPr>
-              <w:t>2.1. Cấu trúc email 5 phần</w:t>
-            </w:r>
-            <w:r>
-              <w:tab/>
-            </w:r>
-            <w:r>
-              <w:fldChar w:fldCharType="begin"/>
-            </w:r>
-            <w:r>
-              <w:instrText xml:space="preserve"> PAGEREF _Toc100048 \h </w:instrText>
-            </w:r>
-            <w:r>
-              <w:fldChar w:fldCharType="separate"/>
-            </w:r>
-            <w:r>
-              <w:t>15</w:t>
-            </w:r>
-            <w:r>
-              <w:fldChar w:fldCharType="end"/>
-            </w:r>
-          </w:hyperlink>
-        </w:p>
-        <w:p>
-          <w:pPr>
-            <w:pStyle w:val="11"/>
-            <w:ind w:left="360"/>
-            <w:tabs>
-              <w:tab w:val="right" w:leader="dot" w:pos="9026"/>
-            </w:tabs>
-            <w:spacing w:before="120" w:after="60"/>
-          </w:pPr>
-          <w:hyperlink w:anchor="_Toc100049" w:history="1">
-            <w:r>
-              <w:rPr>
-                <w:rStyle w:val="Hyperlink"/>
-              </w:rPr>
-              <w:t>2.2. Bộ cụm từ chức năng theo ý đề</w:t>
-            </w:r>
-            <w:r>
-              <w:tab/>
-            </w:r>
-            <w:r>
-              <w:fldChar w:fldCharType="begin"/>
-            </w:r>
-            <w:r>
-              <w:instrText xml:space="preserve"> PAGEREF _Toc100049 \h </w:instrText>
-            </w:r>
-            <w:r>
-              <w:fldChar w:fldCharType="separate"/>
-            </w:r>
-            <w:r>
-              <w:t>16</w:t>
-            </w:r>
-            <w:r>
-              <w:fldChar w:fldCharType="end"/>
-            </w:r>
-          </w:hyperlink>
-        </w:p>
-        <w:p>
-          <w:pPr>
-            <w:pStyle w:val="11"/>
-            <w:ind w:left="360"/>
-            <w:tabs>
-              <w:tab w:val="right" w:leader="dot" w:pos="9026"/>
-            </w:tabs>
-            <w:spacing w:before="120" w:after="60"/>
-          </w:pPr>
-          <w:hyperlink w:anchor="_Toc100050" w:history="1">
-            <w:r>
-              <w:rPr>
-                <w:rStyle w:val="Hyperlink"/>
-              </w:rPr>
-              <w:t>2.3. Hai bài mẫu trong slide</w:t>
-            </w:r>
-            <w:r>
-              <w:tab/>
-            </w:r>
-            <w:r>
-              <w:fldChar w:fldCharType="begin"/>
-            </w:r>
-            <w:r>
-              <w:instrText xml:space="preserve"> PAGEREF _Toc100050 \h </w:instrText>
-            </w:r>
-            <w:r>
-              <w:fldChar w:fldCharType="separate"/>
-            </w:r>
-            <w:r>
-              <w:t>17</w:t>
-            </w:r>
-            <w:r>
-              <w:fldChar w:fldCharType="end"/>
-            </w:r>
-          </w:hyperlink>
-        </w:p>
-        <w:p>
-          <w:pPr>
-            <w:pStyle w:val="12"/>
-            <w:ind w:left="720"/>
-            <w:tabs>
-              <w:tab w:val="right" w:leader="dot" w:pos="9026"/>
-            </w:tabs>
-            <w:spacing w:before="120" w:after="60"/>
-          </w:pPr>
-          <w:hyperlink w:anchor="_Toc100051" w:history="1">
-            <w:r>
-              <w:rPr>
-                <w:rStyle w:val="Hyperlink"/>
-              </w:rPr>
-              <w:t>Bài mẫu 1 — Email cảm ơn (đề: kỳ nghỉ ở vùng quê)</w:t>
-            </w:r>
-            <w:r>
-              <w:tab/>
-            </w:r>
-            <w:r>
-              <w:fldChar w:fldCharType="begin"/>
-            </w:r>
-            <w:r>
-              <w:instrText xml:space="preserve"> PAGEREF _Toc100051 \h </w:instrText>
-            </w:r>
-            <w:r>
-              <w:fldChar w:fldCharType="separate"/>
-            </w:r>
-            <w:r>
-              <w:t>17</w:t>
-            </w:r>
-            <w:r>
-              <w:fldChar w:fldCharType="end"/>
-            </w:r>
-          </w:hyperlink>
-        </w:p>
-        <w:p>
-          <w:pPr>
-            <w:pStyle w:val="12"/>
-            <w:ind w:left="720"/>
-            <w:tabs>
-              <w:tab w:val="right" w:leader="dot" w:pos="9026"/>
-            </w:tabs>
-            <w:spacing w:before="120" w:after="60"/>
-          </w:pPr>
-          <w:hyperlink w:anchor="_Toc100052" w:history="1">
-            <w:r>
-              <w:rPr>
-                <w:rStyle w:val="Hyperlink"/>
-              </w:rPr>
-              <w:t>Bài mẫu 2 — Email xin lỗi (đề: xin hoãn buổi thăm)</w:t>
-            </w:r>
-            <w:r>
-              <w:tab/>
-            </w:r>
-            <w:r>
-              <w:fldChar w:fldCharType="begin"/>
-            </w:r>
-            <w:r>
-              <w:instrText xml:space="preserve"> PAGEREF _Toc100052 \h </w:instrText>
-            </w:r>
-            <w:r>
-              <w:fldChar w:fldCharType="separate"/>
-            </w:r>
-            <w:r>
-              <w:t>17</w:t>
-            </w:r>
-            <w:r>
-              <w:fldChar w:fldCharType="end"/>
-            </w:r>
-          </w:hyperlink>
-        </w:p>
-        <w:p>
-          <w:pPr>
-            <w:pStyle w:val="9"/>
-            <w:tabs>
-              <w:tab w:val="right" w:leader="dot" w:pos="9026"/>
-            </w:tabs>
-            <w:spacing w:before="120" w:after="60"/>
-          </w:pPr>
-          <w:hyperlink w:anchor="_Toc100053" w:history="1">
-            <w:r>
-              <w:rPr>
-                <w:rStyle w:val="Hyperlink"/>
-              </w:rPr>
-              <w:t>PHẦN 3. SPEAKING — CÂU HỎI THEO UNIT VÀ GỢI Ý TRẢ LỜI</w:t>
-            </w:r>
-            <w:r>
-              <w:tab/>
-            </w:r>
-            <w:r>
-              <w:fldChar w:fldCharType="begin"/>
-            </w:r>
-            <w:r>
-              <w:instrText xml:space="preserve"> PAGEREF _Toc100053 \h </w:instrText>
-            </w:r>
-            <w:r>
-              <w:fldChar w:fldCharType="separate"/>
-            </w:r>
-            <w:r>
-              <w:t>17</w:t>
-            </w:r>
-            <w:r>
-              <w:fldChar w:fldCharType="end"/>
-            </w:r>
-          </w:hyperlink>
-        </w:p>
-        <w:p>
-          <w:pPr>
-            <w:pStyle w:val="11"/>
-            <w:ind w:left="360"/>
-            <w:tabs>
-              <w:tab w:val="right" w:leader="dot" w:pos="9026"/>
-            </w:tabs>
-            <w:spacing w:before="120" w:after="60"/>
-          </w:pPr>
-          <w:hyperlink w:anchor="_Toc100054" w:history="1">
-            <w:r>
-              <w:rPr>
-                <w:rStyle w:val="Hyperlink"/>
-              </w:rPr>
-              <w:t>3.1. Unit 1 – Lifestyle (sức khỏe)</w:t>
-            </w:r>
-            <w:r>
-              <w:tab/>
-            </w:r>
-            <w:r>
-              <w:fldChar w:fldCharType="begin"/>
-            </w:r>
-            <w:r>
-              <w:instrText xml:space="preserve"> PAGEREF _Toc100054 \h </w:instrText>
-            </w:r>
-            <w:r>
-              <w:fldChar w:fldCharType="separate"/>
-            </w:r>
-            <w:r>
-              <w:t>18</w:t>
-            </w:r>
-            <w:r>
-              <w:fldChar w:fldCharType="end"/>
-            </w:r>
-          </w:hyperlink>
-        </w:p>
-        <w:p>
-          <w:pPr>
-            <w:pStyle w:val="11"/>
-            <w:ind w:left="360"/>
-            <w:tabs>
-              <w:tab w:val="right" w:leader="dot" w:pos="9026"/>
-            </w:tabs>
-            <w:spacing w:before="120" w:after="60"/>
-          </w:pPr>
-          <w:hyperlink w:anchor="_Toc100055" w:history="1">
-            <w:r>
-              <w:rPr>
-                <w:rStyle w:val="Hyperlink"/>
-              </w:rPr>
-              <w:t>3.2. Unit 2 – Competitions (cuộc thi / câu lạc bộ)</w:t>
-            </w:r>
-            <w:r>
-              <w:tab/>
-            </w:r>
-            <w:r>
-              <w:fldChar w:fldCharType="begin"/>
-            </w:r>
-            <w:r>
-              <w:instrText xml:space="preserve"> PAGEREF _Toc100055 \h </w:instrText>
-            </w:r>
-            <w:r>
-              <w:fldChar w:fldCharType="separate"/>
-            </w:r>
-            <w:r>
-              <w:t>18</w:t>
-            </w:r>
-            <w:r>
-              <w:fldChar w:fldCharType="end"/>
-            </w:r>
-          </w:hyperlink>
-        </w:p>
-        <w:p>
-          <w:pPr>
-            <w:pStyle w:val="11"/>
-            <w:ind w:left="360"/>
-            <w:tabs>
-              <w:tab w:val="right" w:leader="dot" w:pos="9026"/>
-            </w:tabs>
-            <w:spacing w:before="120" w:after="60"/>
-          </w:pPr>
-          <w:hyperlink w:anchor="_Toc100056" w:history="1">
-            <w:r>
-              <w:rPr>
-                <w:rStyle w:val="Hyperlink"/>
-              </w:rPr>
-              <w:t>3.3. Unit 3 – Transport (phương tiện yêu thích)</w:t>
-            </w:r>
-            <w:r>
-              <w:tab/>
-            </w:r>
-            <w:r>
-              <w:fldChar w:fldCharType="begin"/>
-            </w:r>
-            <w:r>
-              <w:instrText xml:space="preserve"> PAGEREF _Toc100056 \h </w:instrText>
-            </w:r>
-            <w:r>
-              <w:fldChar w:fldCharType="separate"/>
-            </w:r>
-            <w:r>
-              <w:t>18</w:t>
-            </w:r>
-            <w:r>
-              <w:fldChar w:fldCharType="end"/>
-            </w:r>
-          </w:hyperlink>
-        </w:p>
-        <w:p>
-          <w:pPr>
-            <w:pStyle w:val="11"/>
-            <w:ind w:left="360"/>
-            <w:tabs>
-              <w:tab w:val="right" w:leader="dot" w:pos="9026"/>
-            </w:tabs>
-            <w:spacing w:before="120" w:after="60"/>
-          </w:pPr>
-          <w:hyperlink w:anchor="_Toc100057" w:history="1">
-            <w:r>
-              <w:rPr>
-                <w:rStyle w:val="Hyperlink"/>
-              </w:rPr>
-              <w:t>3.4. Unit 4 – Challenges (kỳ nghỉ vừa rồi)</w:t>
-            </w:r>
-            <w:r>
-              <w:tab/>
-            </w:r>
-            <w:r>
-              <w:fldChar w:fldCharType="begin"/>
-            </w:r>
-            <w:r>
-              <w:instrText xml:space="preserve"> PAGEREF _Toc100057 \h </w:instrText>
-            </w:r>
-            <w:r>
-              <w:fldChar w:fldCharType="separate"/>
-            </w:r>
-            <w:r>
-              <w:t>18</w:t>
-            </w:r>
-            <w:r>
-              <w:fldChar w:fldCharType="end"/>
-            </w:r>
-          </w:hyperlink>
-        </w:p>
-        <w:p>
-          <w:pPr>
-            <w:pStyle w:val="11"/>
-            <w:ind w:left="360"/>
-            <w:tabs>
-              <w:tab w:val="right" w:leader="dot" w:pos="9026"/>
-            </w:tabs>
-            <w:spacing w:before="120" w:after="60"/>
-          </w:pPr>
-          <w:hyperlink w:anchor="_Toc100058" w:history="1">
-            <w:r>
-              <w:rPr>
-                <w:rStyle w:val="Hyperlink"/>
-              </w:rPr>
-              <w:t>3.5. Unit 5 – Environment (môi trường &amp; quê hương)</w:t>
-            </w:r>
-            <w:r>
-              <w:tab/>
-            </w:r>
-            <w:r>
-              <w:fldChar w:fldCharType="begin"/>
-            </w:r>
-            <w:r>
-              <w:instrText xml:space="preserve"> PAGEREF _Toc100058 \h </w:instrText>
-            </w:r>
-            <w:r>
-              <w:fldChar w:fldCharType="separate"/>
-            </w:r>
-            <w:r>
-              <w:t>18</w:t>
-            </w:r>
-            <w:r>
-              <w:fldChar w:fldCharType="end"/>
-            </w:r>
-          </w:hyperlink>
-        </w:p>
-        <w:p>
-          <w:pPr>
-            <w:pStyle w:val="9"/>
-            <w:tabs>
-              <w:tab w:val="right" w:leader="dot" w:pos="9026"/>
-            </w:tabs>
-            <w:spacing w:before="120" w:after="60"/>
-          </w:pPr>
-          <w:hyperlink w:anchor="_Toc100059" w:history="1">
-            <w:r>
-              <w:rPr>
-                <w:rStyle w:val="Hyperlink"/>
-              </w:rPr>
-              <w:t>PHẦN 4. BÀI TẬP TỰ LUYỆN CÓ ĐÁP ÁN</w:t>
-            </w:r>
-            <w:r>
-              <w:tab/>
-            </w:r>
-            <w:r>
-              <w:fldChar w:fldCharType="begin"/>
-            </w:r>
-            <w:r>
-              <w:instrText xml:space="preserve"> PAGEREF _Toc100059 \h </w:instrText>
-            </w:r>
-            <w:r>
-              <w:fldChar w:fldCharType="separate"/>
-            </w:r>
-            <w:r>
-              <w:t>19</w:t>
-            </w:r>
-            <w:r>
-              <w:fldChar w:fldCharType="end"/>
-            </w:r>
-          </w:hyperlink>
-        </w:p>
-        <w:p>
-          <w:pPr>
-            <w:pStyle w:val="11"/>
-            <w:ind w:left="360"/>
-            <w:tabs>
-              <w:tab w:val="right" w:leader="dot" w:pos="9026"/>
-            </w:tabs>
-            <w:spacing w:before="120" w:after="60"/>
-          </w:pPr>
-          <w:hyperlink w:anchor="_Toc100060" w:history="1">
-            <w:r>
-              <w:rPr>
-                <w:rStyle w:val="Hyperlink"/>
-              </w:rPr>
-              <w:t>4.1. Viết lại câu: hiện tại hoàn thành ↔ quá khứ đơn</w:t>
-            </w:r>
-            <w:r>
-              <w:tab/>
-            </w:r>
-            <w:r>
-              <w:fldChar w:fldCharType="begin"/>
-            </w:r>
-            <w:r>
-              <w:instrText xml:space="preserve"> PAGEREF _Toc100060 \h </w:instrText>
-            </w:r>
-            <w:r>
-              <w:fldChar w:fldCharType="separate"/>
-            </w:r>
-            <w:r>
-              <w:t>19</w:t>
-            </w:r>
-            <w:r>
-              <w:fldChar w:fldCharType="end"/>
-            </w:r>
-          </w:hyperlink>
-        </w:p>
-        <w:p>
-          <w:pPr>
-            <w:pStyle w:val="11"/>
-            <w:ind w:left="360"/>
-            <w:tabs>
-              <w:tab w:val="right" w:leader="dot" w:pos="9026"/>
-            </w:tabs>
-            <w:spacing w:before="120" w:after="60"/>
-          </w:pPr>
-          <w:hyperlink w:anchor="_Toc100061" w:history="1">
-            <w:r>
-              <w:rPr>
-                <w:rStyle w:val="Hyperlink"/>
-              </w:rPr>
-              <w:t>4.2. Nối 2 câu dùng mệnh đề quan hệ (who/whom/which/whose/when)</w:t>
-            </w:r>
-            <w:r>
-              <w:tab/>
-            </w:r>
-            <w:r>
-              <w:fldChar w:fldCharType="begin"/>
-            </w:r>
-            <w:r>
-              <w:instrText xml:space="preserve"> PAGEREF _Toc100061 \h </w:instrText>
-            </w:r>
-            <w:r>
-              <w:fldChar w:fldCharType="separate"/>
-            </w:r>
-            <w:r>
-              <w:t>20</w:t>
-            </w:r>
-            <w:r>
-              <w:fldChar w:fldCharType="end"/>
-            </w:r>
-          </w:hyperlink>
-        </w:p>
-        <w:p>
-          <w:pPr>
-            <w:pStyle w:val="11"/>
-            <w:ind w:left="360"/>
-            <w:tabs>
-              <w:tab w:val="right" w:leader="dot" w:pos="9026"/>
-            </w:tabs>
-            <w:spacing w:before="120" w:after="60"/>
-          </w:pPr>
-          <w:hyperlink w:anchor="_Toc100062" w:history="1">
-            <w:r>
-              <w:rPr>
-                <w:rStyle w:val="Hyperlink"/>
-              </w:rPr>
-              <w:t>4.3. Đổi sang câu bị động</w:t>
-            </w:r>
-            <w:r>
-              <w:tab/>
-            </w:r>
-            <w:r>
-              <w:fldChar w:fldCharType="begin"/>
-            </w:r>
-            <w:r>
-              <w:instrText xml:space="preserve"> PAGEREF _Toc100062 \h </w:instrText>
-            </w:r>
-            <w:r>
-              <w:fldChar w:fldCharType="separate"/>
-            </w:r>
-            <w:r>
-              <w:t>20</w:t>
-            </w:r>
-            <w:r>
-              <w:fldChar w:fldCharType="end"/>
-            </w:r>
-          </w:hyperlink>
-        </w:p>
-        <w:p>
-          <w:pPr>
-            <w:pStyle w:val="11"/>
-            <w:ind w:left="360"/>
-            <w:tabs>
-              <w:tab w:val="right" w:leader="dot" w:pos="9026"/>
-            </w:tabs>
-            <w:spacing w:before="120" w:after="60"/>
-          </w:pPr>
-          <w:hyperlink w:anchor="_Toc100063" w:history="1">
-            <w:r>
-              <w:rPr>
-                <w:rStyle w:val="Hyperlink"/>
-              </w:rPr>
-              <w:t>4.4. Đổi sang câu chủ động</w:t>
-            </w:r>
-            <w:r>
-              <w:tab/>
-            </w:r>
-            <w:r>
-              <w:fldChar w:fldCharType="begin"/>
-            </w:r>
-            <w:r>
-              <w:instrText xml:space="preserve"> PAGEREF _Toc100063 \h </w:instrText>
-            </w:r>
-            <w:r>
-              <w:fldChar w:fldCharType="separate"/>
-            </w:r>
-            <w:r>
-              <w:t>21</w:t>
-            </w:r>
-            <w:r>
-              <w:fldChar w:fldCharType="end"/>
-            </w:r>
-          </w:hyperlink>
-        </w:p>
-        <w:p>
-          <w:pPr>
-            <w:pStyle w:val="9"/>
-            <w:tabs>
-              <w:tab w:val="right" w:leader="dot" w:pos="9026"/>
-            </w:tabs>
-            <w:spacing w:before="120" w:after="60"/>
-          </w:pPr>
-          <w:hyperlink w:anchor="_Toc100064" w:history="1">
-            <w:r>
-              <w:rPr>
-                <w:rStyle w:val="Hyperlink"/>
-              </w:rPr>
-              <w:t>PHỤ LỤC. BẢNG ĐỘNG TỪ BẤT QUY TẮC VÀ TỔNG KẾT CÁC THÌ</w:t>
-            </w:r>
-            <w:r>
-              <w:tab/>
-            </w:r>
-            <w:r>
-              <w:fldChar w:fldCharType="begin"/>
-            </w:r>
-            <w:r>
-              <w:instrText xml:space="preserve"> PAGEREF _Toc100064 \h </w:instrText>
-            </w:r>
-            <w:r>
-              <w:fldChar w:fldCharType="separate"/>
-            </w:r>
-            <w:r>
-              <w:t>22</w:t>
-            </w:r>
-            <w:r>
-              <w:fldChar w:fldCharType="end"/>
-            </w:r>
-          </w:hyperlink>
-        </w:p>
-        <w:p>
-          <w:pPr>
-            <w:pStyle w:val="11"/>
-            <w:ind w:left="360"/>
-            <w:tabs>
-              <w:tab w:val="right" w:leader="dot" w:pos="9026"/>
-            </w:tabs>
-            <w:spacing w:before="120" w:after="60"/>
-          </w:pPr>
-          <w:hyperlink w:anchor="_Toc100065" w:history="1">
-            <w:r>
-              <w:rPr>
-                <w:rStyle w:val="Hyperlink"/>
-              </w:rPr>
-              <w:t>5.1. Động từ bất quy tắc cần thuộc (V1–V2–V3)</w:t>
-            </w:r>
-            <w:r>
-              <w:tab/>
-            </w:r>
-            <w:r>
-              <w:fldChar w:fldCharType="begin"/>
-            </w:r>
-            <w:r>
-              <w:instrText xml:space="preserve"> PAGEREF _Toc100065 \h </w:instrText>
-            </w:r>
-            <w:r>
-              <w:fldChar w:fldCharType="separate"/>
-            </w:r>
-            <w:r>
-              <w:t>22</w:t>
-            </w:r>
-            <w:r>
-              <w:fldChar w:fldCharType="end"/>
-            </w:r>
-          </w:hyperlink>
-        </w:p>
-        <w:p>
-          <w:pPr>
-            <w:pStyle w:val="11"/>
-            <w:ind w:left="360"/>
-            <w:tabs>
-              <w:tab w:val="right" w:leader="dot" w:pos="9026"/>
-            </w:tabs>
-            <w:spacing w:before="120" w:after="60"/>
-          </w:pPr>
-          <w:hyperlink w:anchor="_Toc100066" w:history="1">
-            <w:r>
-              <w:rPr>
-                <w:rStyle w:val="Hyperlink"/>
-              </w:rPr>
-              <w:t>5.2. Tổng kết nhanh 6 thì + 2 dạng tương lai</w:t>
-            </w:r>
-            <w:r>
-              <w:tab/>
-            </w:r>
-            <w:r>
-              <w:fldChar w:fldCharType="begin"/>
-            </w:r>
-            <w:r>
-              <w:instrText xml:space="preserve"> PAGEREF _Toc100066 \h </w:instrText>
-            </w:r>
-            <w:r>
-              <w:fldChar w:fldCharType="separate"/>
-            </w:r>
-            <w:r>
-              <w:t>22</w:t>
-            </w:r>
-            <w:r>
-              <w:fldChar w:fldCharType="end"/>
-            </w:r>
-          </w:hyperlink>
-        </w:p>
-        <w:p>
-          <w:pPr>
-            <w:pStyle w:val="9"/>
-            <w:tabs>
-              <w:tab w:val="right" w:leader="dot" w:pos="9026"/>
-            </w:tabs>
-            <w:spacing w:before="120" w:after="60"/>
-          </w:pPr>
-          <w:hyperlink w:anchor="_Toc100067" w:history="1">
-            <w:r>
-              <w:rPr>
-                <w:rStyle w:val="Hyperlink"/>
-              </w:rPr>
-              <w:t>KẾT LUẬN</w:t>
-            </w:r>
-            <w:r>
-              <w:tab/>
-            </w:r>
-            <w:r>
-              <w:fldChar w:fldCharType="begin"/>
-            </w:r>
-            <w:r>
-              <w:instrText xml:space="preserve"> PAGEREF _Toc100067 \h </w:instrText>
-            </w:r>
-            <w:r>
-              <w:fldChar w:fldCharType="separate"/>
-            </w:r>
-            <w:r>
-              <w:t>23</w:t>
-            </w:r>
-            <w:r>
-              <w:fldChar w:fldCharType="end"/>
-            </w:r>
-          </w:hyperlink>
-        </w:p>
-        <w:p>
-          <w:pPr>
-            <w:pStyle w:val="11"/>
-            <w:ind w:left="360"/>
-            <w:tabs>
-              <w:tab w:val="right" w:leader="dot" w:pos="9026"/>
-            </w:tabs>
-            <w:spacing w:before="120" w:after="60"/>
-          </w:pPr>
-          <w:hyperlink w:anchor="_Toc100068" w:history="1">
-            <w:r>
-              <w:rPr>
-                <w:rStyle w:val="Hyperlink"/>
-              </w:rPr>
-              <w:t>1. Những kết quả đạt được</w:t>
-            </w:r>
-            <w:r>
-              <w:tab/>
-            </w:r>
-            <w:r>
-              <w:fldChar w:fldCharType="begin"/>
-            </w:r>
-            <w:r>
-              <w:instrText xml:space="preserve"> PAGEREF _Toc100068 \h </w:instrText>
-            </w:r>
-            <w:r>
-              <w:fldChar w:fldCharType="separate"/>
-            </w:r>
-            <w:r>
-              <w:t>23</w:t>
-            </w:r>
-            <w:r>
-              <w:fldChar w:fldCharType="end"/>
-            </w:r>
-          </w:hyperlink>
-        </w:p>
-        <w:p>
-          <w:pPr>
-            <w:pStyle w:val="11"/>
-            <w:ind w:left="360"/>
-            <w:tabs>
-              <w:tab w:val="right" w:leader="dot" w:pos="9026"/>
-            </w:tabs>
-            <w:spacing w:before="120" w:after="60"/>
-          </w:pPr>
-          <w:hyperlink w:anchor="_Toc100069" w:history="1">
-            <w:r>
-              <w:rPr>
-                <w:rStyle w:val="Hyperlink"/>
-              </w:rPr>
-              <w:t>2. Kế hoạch tự học tiếp theo</w:t>
-            </w:r>
-            <w:r>
-              <w:tab/>
-            </w:r>
-            <w:r>
-              <w:fldChar w:fldCharType="begin"/>
-            </w:r>
-            <w:r>
-              <w:instrText xml:space="preserve"> PAGEREF _Toc100069 \h </w:instrText>
-            </w:r>
-            <w:r>
-              <w:fldChar w:fldCharType="separate"/>
-            </w:r>
-            <w:r>
-              <w:t>23</w:t>
-            </w:r>
-            <w:r>
-              <w:fldChar w:fldCharType="end"/>
-            </w:r>
-          </w:hyperlink>
-        </w:p>
-        <w:p>
-          <w:r>
-            <w:fldChar w:fldCharType="end"/>
-          </w:r>
-        </w:p>
-      </w:sdtContent>
-    </w:sdt>
-    <w:p>
-      <w:pPr>
-        <w:spacing w:before="200"/>
-      </w:pPr>
-      <w:r>
-        <w:rPr>
-          <w:rFonts w:ascii="Times New Roman" w:cs="Times New Roman" w:eastAsia="Times New Roman" w:hAnsi="Times New Roman"/>
-          <w:i/>
-          <w:iCs/>
-          <w:color w:val="888888"/>
-          <w:sz w:val="18"/>
-          <w:szCs w:val="18"/>
-        </w:rPr>
-        <w:t xml:space="preserve">Ghi chú: Mục lục tạo bằng trường công (field). Để cập nhật số trang chính xác, bấm chuột phải vào mục lục và chọn "Update Field".</w:t>
+        <w:t xml:space="preserve">PHẦN MỞ ĐẦU</w:t>
       </w:r>
     </w:p>
     <w:p>
       <w:pPr>
-        <w:sectPr>
-          <w:footerReference w:type="default" r:id="rId7"/>
-          <w:type w:val="nextPage"/>
-          <w:pgSz w:w="11906" w:h="16838" w:orient="portrait"/>
-          <w:pgMar w:top="1440" w:right="1417" w:bottom="1440" w:left="1701" w:header="708" w:footer="708" w:gutter="0"/>
-          <w:pgNumType w:start="1" w:fmt="upperRoman"/>
-          <w:docGrid w:linePitch="360"/>
-        </w:sectPr>
-      </w:pPr>
+        <w:spacing w:after="60" w:line="312"/>
+        <w:jc w:val="both"/>
+      </w:pPr>
+      <w:r>
+        <w:rPr>
+          <w:rFonts w:ascii="Times New Roman" w:cs="Times New Roman" w:eastAsia="Times New Roman" w:hAnsi="Times New Roman"/>
+          <w:color w:val="000000"/>
+          <w:sz w:val="24"/>
+          <w:szCs w:val="24"/>
+        </w:rPr>
+        <w:t xml:space="preserve">Em là Hồ Quang Huy, mã sinh viên 24S1020030. Báo cáo này là sản phẩm tự học của em trong học kỳ vừa qua, tổng hợp lại toàn bộ kiến thức môn Tiếng Anh B1 đã được giảng viên dạy trên lớp từ Unit 1 đến Unit 10. Nội dung gồm ngữ pháp theo từng unit kèm bảng tổng hợp và ví dụ, cấu trúc viết email thân mật, câu hỏi speaking và bài tập tự luyện có đáp án ở cuối báo cáo. Em sắp xếp theo đúng thứ tự dạy trên lớp để tiện ôn tập và đối chiếu với vở ghi. Em mong nhận được nhận xét của giảng viên để hoàn thiện hơn.</w:t>
+      </w:r>
     </w:p>
     <w:p>
       <w:pPr>
@@ -2814,7 +230,6 @@
         <w:keepNext/>
         <w:spacing w:after="160" w:before="360" w:line="380" w:lineRule="atLeast"/>
       </w:pPr>
-      <w:bookmarkStart w:id="100000" w:name="_Toc100000"/>
       <w:r>
         <w:rPr>
           <w:rFonts w:ascii="Times New Roman" w:cs="Times New Roman" w:eastAsia="Times New Roman" w:hAnsi="Times New Roman"/>
@@ -2824,9 +239,23 @@
           <w:sz w:val="32"/>
           <w:szCs w:val="32"/>
         </w:rPr>
-        <w:t xml:space="preserve">PHẦN MỞ ĐẦU</w:t>
-      </w:r>
-      <w:bookmarkEnd w:id="100000"/>
+        <w:t xml:space="preserve">PHẦN 1. NGỮ PHÁP CỐT LÕI THEO UNIT</w:t>
+      </w:r>
+    </w:p>
+    <w:p>
+      <w:pPr>
+        <w:spacing w:after="60" w:line="312"/>
+        <w:jc w:val="both"/>
+      </w:pPr>
+      <w:r>
+        <w:rPr>
+          <w:rFonts w:ascii="Times New Roman" w:cs="Times New Roman" w:eastAsia="Times New Roman" w:hAnsi="Times New Roman"/>
+          <w:color w:val="000000"/>
+          <w:sz w:val="24"/>
+          <w:szCs w:val="24"/>
+        </w:rPr>
+        <w:t xml:space="preserve">Phần này tổng hợp toàn bộ ngữ pháp xuất hiện trong slide bài giảng của 10 unit, sắp xếp theo đúng thứ tự giáo viên dạy trên lớp. Mỗi chủ đề gồm: công thức, cách dùng và ví dụ nguyên bản trong slide. Khi chép vào vở, ưu tiên chép công thức và ví dụ in đậm vì đây là phần gần như chắc chắn ra đề (viết lại câu, chia động từ, điền từ).</w:t>
+      </w:r>
     </w:p>
     <w:p>
       <w:pPr>
@@ -2834,7 +263,6 @@
         <w:keepNext/>
         <w:spacing w:after="120" w:before="280" w:line="340" w:lineRule="atLeast"/>
       </w:pPr>
-      <w:bookmarkStart w:id="100001" w:name="_Toc100001"/>
       <w:r>
         <w:rPr>
           <w:rFonts w:ascii="Times New Roman" w:cs="Times New Roman" w:eastAsia="Times New Roman" w:hAnsi="Times New Roman"/>
@@ -2844,196 +272,8 @@
           <w:sz w:val="28"/>
           <w:szCs w:val="28"/>
         </w:rPr>
-        <w:t xml:space="preserve">1. Lý do và mục đích tự học</w:t>
-      </w:r>
-      <w:bookmarkEnd w:id="100001"/>
-    </w:p>
-    <w:p>
-      <w:pPr>
-        <w:spacing w:after="60" w:line="312"/>
-        <w:jc w:val="both"/>
-      </w:pPr>
-      <w:r>
-        <w:rPr>
-          <w:rFonts w:ascii="Times New Roman" w:cs="Times New Roman" w:eastAsia="Times New Roman" w:hAnsi="Times New Roman"/>
-          <w:color w:val="000000"/>
-          <w:sz w:val="24"/>
-          <w:szCs w:val="24"/>
-        </w:rPr>
-        <w:t xml:space="preserve">Trong học kỳ vừa qua, môn học Tiếng Anh B1 đã trang bị cho em một hệ thống kiến thức trải dài từ Unit 1 đến Unit 10, đi kèm các chủ điểm nâng cao như động từ khuyết khuyết, câu điều kiện loại 0 và loại 1, cùng kỹ năng viết email thân mật. Toàn bộ bài giảng được giáo viên trình bày trên slide và giảng dạy trực tiếp trên lớp, kèm theo nhiều bài tập thực hành ngay tại tiết học. Tuy nhiên, lượng kiến thức này khá phân tán theo từng tuần học, mỗi unit lại có một chủ điểm ngữ pháp riêng, nên việc ôn tập trở nên khó khăn nếu không có sự hệ thống lại một cách khoa học.</w:t>
-      </w:r>
-    </w:p>
-    <w:p>
-      <w:pPr>
-        <w:spacing w:after="60" w:line="312"/>
-        <w:jc w:val="both"/>
-      </w:pPr>
-      <w:r>
-        <w:rPr>
-          <w:rFonts w:ascii="Times New Roman" w:cs="Times New Roman" w:eastAsia="Times New Roman" w:hAnsi="Times New Roman"/>
-          <w:color w:val="000000"/>
-          <w:sz w:val="24"/>
-          <w:szCs w:val="24"/>
-        </w:rPr>
-        <w:t xml:space="preserve">Xuất phát từ lý do đó, em thực hiện báo cáo tự học này với ba mục đích chính. Thứ nhất, tổng hợp lại toàn bộ kiến thức đã học theo đúng thứ tự trên lớp để dễ đối chiếu với vở ghi và slide bài giảng. Thứ hai, trình bày kiến thức dưới dạng công thức, bảng biểu và ví dụ minh họa ngắn gọn để phục vụ việc ôn tập lặp lại (spaced repetition) trước kỳ thi. Thứ ba, tự đánh giá mức độ nắm bắt của bản thân thông qua phần bài tập tự luyện có đáp án ở cuối báo cáo, từ đó phát hiện và khắc phục kịp thời những điểm còn yếu.</w:t>
-      </w:r>
-    </w:p>
-    <w:p>
-      <w:pPr>
-        <w:pStyle w:val="Heading2"/>
-        <w:keepNext/>
-        <w:spacing w:after="120" w:before="280" w:line="340" w:lineRule="atLeast"/>
-      </w:pPr>
-      <w:bookmarkStart w:id="100002" w:name="_Toc100002"/>
-      <w:r>
-        <w:rPr>
-          <w:rFonts w:ascii="Times New Roman" w:cs="Times New Roman" w:eastAsia="Times New Roman" w:hAnsi="Times New Roman"/>
-          <w:b/>
-          <w:bCs/>
-          <w:color w:val="1A3A3A"/>
-          <w:sz w:val="28"/>
-          <w:szCs w:val="28"/>
-        </w:rPr>
-        <w:t xml:space="preserve">2. Phạm vi và nguồn tài liệu</w:t>
-      </w:r>
-      <w:bookmarkEnd w:id="100002"/>
-    </w:p>
-    <w:p>
-      <w:pPr>
-        <w:spacing w:after="60" w:line="312"/>
-        <w:jc w:val="both"/>
-      </w:pPr>
-      <w:r>
-        <w:rPr>
-          <w:rFonts w:ascii="Times New Roman" w:cs="Times New Roman" w:eastAsia="Times New Roman" w:hAnsi="Times New Roman"/>
-          <w:color w:val="000000"/>
-          <w:sz w:val="24"/>
-          <w:szCs w:val="24"/>
-        </w:rPr>
-        <w:t xml:space="preserve">Phạm vi kiến thức của báo cáo bao trùm toàn bộ nội dung đã được dạy trong học kỳ, cụ thể gồm: cách nói giờ trong tiếng Anh; Unit 1 (Lifestyle) với thì hiện tại đơn, trạng từ tần suất và hiện tại tiếp diễn; Unit 2 (Competitions) với dạng động từ V-ing và to-infinitive; động từ khuyết khuyết (modal verbs); Unit 3 (Transport) với ba dạng so sánh và trạng từ; Unit 4 (Challenges) với quá khứ đơn và quá khứ tiếp diễn; Unit 5 (The Environment) với lượng từ, mạo từ và cấu trúc made of/from/by/in; kỹ năng viết email thân mật 35–45 từ; Unit 6 (Stages in Life) với to-V chỉ mục đích và các dạng thì tương lai; Unit 7 (Work) với hiện tại hoàn thành; Unit 8 (Technology) với mệnh đề quan hệ; câu điều kiện loại 0 và loại 1; Unit 9 (Holidays) với quá khứ hoàn thành; và Unit 10 (Products) với câu bị động.</w:t>
-      </w:r>
-    </w:p>
-    <w:p>
-      <w:pPr>
-        <w:spacing w:after="60" w:line="312"/>
-        <w:jc w:val="both"/>
-      </w:pPr>
-      <w:r>
-        <w:rPr>
-          <w:rFonts w:ascii="Times New Roman" w:cs="Times New Roman" w:eastAsia="Times New Roman" w:hAnsi="Times New Roman"/>
-          <w:color w:val="000000"/>
-          <w:sz w:val="24"/>
-          <w:szCs w:val="24"/>
-        </w:rPr>
-        <w:t xml:space="preserve">Nguồn tài liệu duy nhất được sử dụng để tổng hợp là slide bài giảng của giáo viên trên lớp và phần ghi chép của em trong vở, không sử dụng thêm nguồn ngoài để đảm bảo nội dung khớp đúng với những gì đã được dạy. Các ví dụ trong báo cáo đều giữ nguyên hoặc lấy cảm hứng trực tiếp từ ví dụ trên slide. Riêng phần đáp án bài tập, một số câu trên slide chỉ đề bài, em đã tự giải và đối chiếu lại với thầy cô, bạn bè trước khi đưa vào báo cáo.</w:t>
-      </w:r>
-    </w:p>
-    <w:p>
-      <w:pPr>
-        <w:pStyle w:val="Heading2"/>
-        <w:keepNext/>
-        <w:spacing w:after="120" w:before="280" w:line="340" w:lineRule="atLeast"/>
-      </w:pPr>
-      <w:bookmarkStart w:id="100003" w:name="_Toc100003"/>
-      <w:r>
-        <w:rPr>
-          <w:rFonts w:ascii="Times New Roman" w:cs="Times New Roman" w:eastAsia="Times New Roman" w:hAnsi="Times New Roman"/>
-          <w:b/>
-          <w:bCs/>
-          <w:color w:val="1A3A3A"/>
-          <w:sz w:val="28"/>
-          <w:szCs w:val="28"/>
-        </w:rPr>
-        <w:t xml:space="preserve">3. Phương pháp trình bày</w:t>
-      </w:r>
-      <w:bookmarkEnd w:id="100003"/>
-    </w:p>
-    <w:p>
-      <w:pPr>
-        <w:spacing w:after="60" w:line="312"/>
-        <w:jc w:val="both"/>
-      </w:pPr>
-      <w:r>
-        <w:rPr>
-          <w:rFonts w:ascii="Times New Roman" w:cs="Times New Roman" w:eastAsia="Times New Roman" w:hAnsi="Times New Roman"/>
-          <w:color w:val="000000"/>
-          <w:sz w:val="24"/>
-          <w:szCs w:val="24"/>
-        </w:rPr>
-        <w:t xml:space="preserve">Báo cáo được sắp xếp theo năm phần chính. Phần 1 tổng hợp ngữ pháp cốt lõi theo từng unit với công thức, quy tắc và ví dụ; mỗi chủ điểm ưu tiên dạng bảng để dễ tra cứu và dễ nhớ. Phần 2 trình bày cấu trúc một email thân mật hoàn chỉnh kèm hai bài mẫu của giáo viên. Phần 3 tập hợp câu hỏi speaking theo từng unit kèm gợi ý trả lời. Phần 4 là bốn nhóm bài tập tự luyện (44 câu) có đáp án chi tiết để tự kiểm tra. Cuối cùng là phụ lục gồm bảng động từ bất quy tắc và bảng tổng kết các thì đã học.</w:t>
-      </w:r>
-    </w:p>
-    <w:p>
-      <w:pPr>
-        <w:spacing w:after="100" w:before="40" w:line="312"/>
-        <w:jc w:val="left"/>
-      </w:pPr>
-      <w:r>
-        <w:rPr>
-          <w:rFonts w:ascii="Times New Roman" w:cs="Times New Roman" w:eastAsia="Times New Roman" w:hAnsi="Times New Roman"/>
-          <w:i/>
-          <w:iCs/>
-          <w:color w:val="507070"/>
-          <w:sz w:val="21"/>
-          <w:szCs w:val="21"/>
-        </w:rPr>
-        <w:t xml:space="preserve">Lưu ý của em: khi ôn tập, em đọc kỹ công thức và ví dụ in đậm trước, sau đó tự làm lại bài tập ở Phần 4 mà không nhìn đáp án, chỉ mở đáp án để chấm và ghi nhận các câu sai vào nhật ký ôn tập.</w:t>
-      </w:r>
-    </w:p>
-    <w:p>
-      <w:pPr>
-        <w:pStyle w:val="Heading1"/>
-        <w:keepNext/>
-        <w:spacing w:after="160" w:before="360" w:line="380" w:lineRule="atLeast"/>
-      </w:pPr>
-      <w:bookmarkStart w:id="100004" w:name="_Toc100004"/>
-      <w:r>
-        <w:rPr>
-          <w:rFonts w:ascii="Times New Roman" w:cs="Times New Roman" w:eastAsia="Times New Roman" w:hAnsi="Times New Roman"/>
-          <w:b/>
-          <w:bCs/>
-          <w:color w:val="1A3A3A"/>
-          <w:sz w:val="32"/>
-          <w:szCs w:val="32"/>
-        </w:rPr>
-        <w:t xml:space="preserve">PHẦN 1. NGỮ PHÁP CỐT LÕI THEO UNIT</w:t>
-      </w:r>
-      <w:bookmarkEnd w:id="100004"/>
-    </w:p>
-    <w:p>
-      <w:pPr>
-        <w:spacing w:after="60" w:line="312"/>
-        <w:jc w:val="both"/>
-      </w:pPr>
-      <w:r>
-        <w:rPr>
-          <w:rFonts w:ascii="Times New Roman" w:cs="Times New Roman" w:eastAsia="Times New Roman" w:hAnsi="Times New Roman"/>
-          <w:color w:val="000000"/>
-          <w:sz w:val="24"/>
-          <w:szCs w:val="24"/>
-        </w:rPr>
-        <w:t xml:space="preserve">Phần này tổng hợp toàn bộ ngữ pháp xuất hiện trong slide bài giảng của 10 unit, sắp xếp theo đúng thứ tự giáo viên dạy trên lớp. Mỗi chủ đề gồm: công thức, cách dùng và ví dụ nguyên bản trong slide. Khi chép vào vở, ưu tiên chép công thức và ví dụ in đậm vì đây là phần gần như chắc chắn ra đề (viết lại câu, chia động từ, điền từ).</w:t>
-      </w:r>
-    </w:p>
-    <w:p>
-      <w:pPr>
-        <w:pStyle w:val="Heading2"/>
-        <w:keepNext/>
-        <w:spacing w:after="120" w:before="280" w:line="340" w:lineRule="atLeast"/>
-      </w:pPr>
-      <w:bookmarkStart w:id="100005" w:name="_Toc100005"/>
-      <w:r>
-        <w:rPr>
-          <w:rFonts w:ascii="Times New Roman" w:cs="Times New Roman" w:eastAsia="Times New Roman" w:hAnsi="Times New Roman"/>
-          <w:b/>
-          <w:bCs/>
-          <w:color w:val="1A3A3A"/>
-          <w:sz w:val="28"/>
-          <w:szCs w:val="28"/>
-        </w:rPr>
         <w:t xml:space="preserve">1.1. Nói giờ (Telling the time)</w:t>
       </w:r>
-      <w:bookmarkEnd w:id="100005"/>
     </w:p>
     <w:p>
       <w:pPr>
@@ -3582,7 +822,6 @@
         <w:keepNext/>
         <w:spacing w:after="120" w:before="280" w:line="340" w:lineRule="atLeast"/>
       </w:pPr>
-      <w:bookmarkStart w:id="100006" w:name="_Toc100006"/>
       <w:r>
         <w:rPr>
           <w:rFonts w:ascii="Times New Roman" w:cs="Times New Roman" w:eastAsia="Times New Roman" w:hAnsi="Times New Roman"/>
@@ -3594,7 +833,6 @@
         </w:rPr>
         <w:t xml:space="preserve">1.2. Unit 1 – Lifestyle: Hiện tại đơn, trạng từ tần suất, hiện tại tiếp diễn</w:t>
       </w:r>
-      <w:bookmarkEnd w:id="100006"/>
     </w:p>
     <w:p>
       <w:pPr>
@@ -3602,7 +840,6 @@
         <w:keepNext/>
         <w:spacing w:after="80" w:before="200" w:line="312"/>
       </w:pPr>
-      <w:bookmarkStart w:id="100007" w:name="_Toc100007"/>
       <w:r>
         <w:rPr>
           <w:rFonts w:ascii="Times New Roman" w:cs="Times New Roman" w:eastAsia="Times New Roman" w:hAnsi="Times New Roman"/>
@@ -3614,7 +851,6 @@
         </w:rPr>
         <w:t xml:space="preserve">a) Thì hiện tại đơn (Simple Present)</w:t>
       </w:r>
-      <w:bookmarkEnd w:id="100007"/>
     </w:p>
     <w:p>
       <w:pPr>
@@ -3756,7 +992,6 @@
         <w:keepNext/>
         <w:spacing w:after="80" w:before="200" w:line="312"/>
       </w:pPr>
-      <w:bookmarkStart w:id="100008" w:name="_Toc100008"/>
       <w:r>
         <w:rPr>
           <w:rFonts w:ascii="Times New Roman" w:cs="Times New Roman" w:eastAsia="Times New Roman" w:hAnsi="Times New Roman"/>
@@ -3768,7 +1003,6 @@
         </w:rPr>
         <w:t xml:space="preserve">b) Trạng từ tần suất (Adverbs of frequency)</w:t>
       </w:r>
-      <w:bookmarkEnd w:id="100008"/>
     </w:p>
     <w:p>
       <w:pPr>
@@ -4648,7 +1882,6 @@
         <w:keepNext/>
         <w:spacing w:after="80" w:before="200" w:line="312"/>
       </w:pPr>
-      <w:bookmarkStart w:id="100009" w:name="_Toc100009"/>
       <w:r>
         <w:rPr>
           <w:rFonts w:ascii="Times New Roman" w:cs="Times New Roman" w:eastAsia="Times New Roman" w:hAnsi="Times New Roman"/>
@@ -4660,7 +1893,6 @@
         </w:rPr>
         <w:t xml:space="preserve">c) Thì hiện tại tiếp diễn (Present Continuous)</w:t>
       </w:r>
-      <w:bookmarkEnd w:id="100009"/>
     </w:p>
     <w:p>
       <w:pPr>
@@ -4830,7 +2062,6 @@
         <w:keepNext/>
         <w:spacing w:after="120" w:before="280" w:line="340" w:lineRule="atLeast"/>
       </w:pPr>
-      <w:bookmarkStart w:id="100010" w:name="_Toc100010"/>
       <w:r>
         <w:rPr>
           <w:rFonts w:ascii="Times New Roman" w:cs="Times New Roman" w:eastAsia="Times New Roman" w:hAnsi="Times New Roman"/>
@@ -4842,7 +2073,6 @@
         </w:rPr>
         <w:t xml:space="preserve">1.3. Unit 2 – Competitions: V-ing và To-infinitive</w:t>
       </w:r>
-      <w:bookmarkEnd w:id="100010"/>
     </w:p>
     <w:p>
       <w:pPr>
@@ -4850,7 +2080,6 @@
         <w:keepNext/>
         <w:spacing w:after="80" w:before="200" w:line="312"/>
       </w:pPr>
-      <w:bookmarkStart w:id="100011" w:name="_Toc100011"/>
       <w:r>
         <w:rPr>
           <w:rFonts w:ascii="Times New Roman" w:cs="Times New Roman" w:eastAsia="Times New Roman" w:hAnsi="Times New Roman"/>
@@ -4862,7 +2091,6 @@
         </w:rPr>
         <w:t xml:space="preserve">a) V-ing làm chủ ngữ, tân ngữ, sau giới từ</w:t>
       </w:r>
-      <w:bookmarkEnd w:id="100011"/>
     </w:p>
     <w:p>
       <w:pPr>
@@ -5957,7 +3185,6 @@
         <w:keepNext/>
         <w:spacing w:after="80" w:before="200" w:line="312"/>
       </w:pPr>
-      <w:bookmarkStart w:id="100012" w:name="_Toc100012"/>
       <w:r>
         <w:rPr>
           <w:rFonts w:ascii="Times New Roman" w:cs="Times New Roman" w:eastAsia="Times New Roman" w:hAnsi="Times New Roman"/>
@@ -5969,7 +3196,6 @@
         </w:rPr>
         <w:t xml:space="preserve">b) Động từ + to-infinitive</w:t>
       </w:r>
-      <w:bookmarkEnd w:id="100012"/>
     </w:p>
     <w:p>
       <w:pPr>
@@ -7158,7 +4384,6 @@
         <w:keepNext/>
         <w:spacing w:after="80" w:before="200" w:line="312"/>
       </w:pPr>
-      <w:bookmarkStart w:id="100013" w:name="_Toc100013"/>
       <w:r>
         <w:rPr>
           <w:rFonts w:ascii="Times New Roman" w:cs="Times New Roman" w:eastAsia="Times New Roman" w:hAnsi="Times New Roman"/>
@@ -7170,7 +4395,6 @@
         </w:rPr>
         <w:t xml:space="preserve">c) V-ing hay to-inf? (các cặp đổi nghĩa)</w:t>
       </w:r>
-      <w:bookmarkEnd w:id="100013"/>
     </w:p>
     <w:p>
       <w:pPr>
@@ -7448,7 +4672,6 @@
         <w:keepNext/>
         <w:spacing w:after="120" w:before="280" w:line="340" w:lineRule="atLeast"/>
       </w:pPr>
-      <w:bookmarkStart w:id="100014" w:name="_Toc100014"/>
       <w:r>
         <w:rPr>
           <w:rFonts w:ascii="Times New Roman" w:cs="Times New Roman" w:eastAsia="Times New Roman" w:hAnsi="Times New Roman"/>
@@ -7460,7 +4683,6 @@
         </w:rPr>
         <w:t xml:space="preserve">1.4. Động từ khiếm khuyết (Modal verbs)</w:t>
       </w:r>
-      <w:bookmarkEnd w:id="100014"/>
     </w:p>
     <w:p>
       <w:pPr>
@@ -8469,7 +5691,6 @@
         <w:keepNext/>
         <w:spacing w:after="120" w:before="280" w:line="340" w:lineRule="atLeast"/>
       </w:pPr>
-      <w:bookmarkStart w:id="100015" w:name="_Toc100015"/>
       <w:r>
         <w:rPr>
           <w:rFonts w:ascii="Times New Roman" w:cs="Times New Roman" w:eastAsia="Times New Roman" w:hAnsi="Times New Roman"/>
@@ -8481,7 +5702,6 @@
         </w:rPr>
         <w:t xml:space="preserve">1.5. Unit 3 – Transport: So sánh (Comparisons)</w:t>
       </w:r>
-      <w:bookmarkEnd w:id="100015"/>
     </w:p>
     <w:p>
       <w:pPr>
@@ -8489,7 +5709,6 @@
         <w:keepNext/>
         <w:spacing w:after="80" w:before="200" w:line="312"/>
       </w:pPr>
-      <w:bookmarkStart w:id="100016" w:name="_Toc100016"/>
       <w:r>
         <w:rPr>
           <w:rFonts w:ascii="Times New Roman" w:cs="Times New Roman" w:eastAsia="Times New Roman" w:hAnsi="Times New Roman"/>
@@ -8501,7 +5720,6 @@
         </w:rPr>
         <w:t xml:space="preserve">a) So sánh bằng / không bằng</w:t>
       </w:r>
-      <w:bookmarkEnd w:id="100016"/>
     </w:p>
     <w:p>
       <w:pPr>
@@ -8563,7 +5781,6 @@
         <w:keepNext/>
         <w:spacing w:after="80" w:before="200" w:line="312"/>
       </w:pPr>
-      <w:bookmarkStart w:id="100017" w:name="_Toc100017"/>
       <w:r>
         <w:rPr>
           <w:rFonts w:ascii="Times New Roman" w:cs="Times New Roman" w:eastAsia="Times New Roman" w:hAnsi="Times New Roman"/>
@@ -8575,7 +5792,6 @@
         </w:rPr>
         <w:t xml:space="preserve">b) Tính từ / trạng từ ngắn và dài</w:t>
       </w:r>
-      <w:bookmarkEnd w:id="100017"/>
     </w:p>
     <w:p>
       <w:pPr>
@@ -8676,7 +5892,6 @@
         <w:keepNext/>
         <w:spacing w:after="80" w:before="200" w:line="312"/>
       </w:pPr>
-      <w:bookmarkStart w:id="100018" w:name="_Toc100018"/>
       <w:r>
         <w:rPr>
           <w:rFonts w:ascii="Times New Roman" w:cs="Times New Roman" w:eastAsia="Times New Roman" w:hAnsi="Times New Roman"/>
@@ -8688,7 +5903,6 @@
         </w:rPr>
         <w:t xml:space="preserve">c) So sánh hơn (Comparative)</w:t>
       </w:r>
-      <w:bookmarkEnd w:id="100018"/>
     </w:p>
     <w:p>
       <w:pPr>
@@ -9366,7 +6580,6 @@
         <w:keepNext/>
         <w:spacing w:after="80" w:before="200" w:line="312"/>
       </w:pPr>
-      <w:bookmarkStart w:id="100019" w:name="_Toc100019"/>
       <w:r>
         <w:rPr>
           <w:rFonts w:ascii="Times New Roman" w:cs="Times New Roman" w:eastAsia="Times New Roman" w:hAnsi="Times New Roman"/>
@@ -9378,7 +6591,6 @@
         </w:rPr>
         <w:t xml:space="preserve">d) So sánh nhất (Superlative)</w:t>
       </w:r>
-      <w:bookmarkEnd w:id="100019"/>
     </w:p>
     <w:p>
       <w:pPr>
@@ -9440,7 +6652,6 @@
         <w:keepNext/>
         <w:spacing w:after="120" w:before="280" w:line="340" w:lineRule="atLeast"/>
       </w:pPr>
-      <w:bookmarkStart w:id="100020" w:name="_Toc100020"/>
       <w:r>
         <w:rPr>
           <w:rFonts w:ascii="Times New Roman" w:cs="Times New Roman" w:eastAsia="Times New Roman" w:hAnsi="Times New Roman"/>
@@ -9452,7 +6663,6 @@
         </w:rPr>
         <w:t xml:space="preserve">1.6. Unit 4 – Challenges: Quá khứ đơn và quá khứ tiếp diễn</w:t>
       </w:r>
-      <w:bookmarkEnd w:id="100020"/>
     </w:p>
     <w:p>
       <w:pPr>
@@ -9460,7 +6670,6 @@
         <w:keepNext/>
         <w:spacing w:after="80" w:before="200" w:line="312"/>
       </w:pPr>
-      <w:bookmarkStart w:id="100021" w:name="_Toc100021"/>
       <w:r>
         <w:rPr>
           <w:rFonts w:ascii="Times New Roman" w:cs="Times New Roman" w:eastAsia="Times New Roman" w:hAnsi="Times New Roman"/>
@@ -9472,7 +6681,6 @@
         </w:rPr>
         <w:t xml:space="preserve">a) Thì quá khứ đơn (Simple Past)</w:t>
       </w:r>
-      <w:bookmarkEnd w:id="100021"/>
     </w:p>
     <w:p>
       <w:pPr>
@@ -9939,7 +7147,6 @@
         <w:keepNext/>
         <w:spacing w:after="80" w:before="200" w:line="312"/>
       </w:pPr>
-      <w:bookmarkStart w:id="100022" w:name="_Toc100022"/>
       <w:r>
         <w:rPr>
           <w:rFonts w:ascii="Times New Roman" w:cs="Times New Roman" w:eastAsia="Times New Roman" w:hAnsi="Times New Roman"/>
@@ -9951,7 +7158,6 @@
         </w:rPr>
         <w:t xml:space="preserve">b) Quy tắc thêm -ed (V-ed của động từ có quy tắc)</w:t>
       </w:r>
-      <w:bookmarkEnd w:id="100022"/>
     </w:p>
     <w:p>
       <w:pPr>
@@ -10039,7 +7245,6 @@
         <w:keepNext/>
         <w:spacing w:after="80" w:before="200" w:line="312"/>
       </w:pPr>
-      <w:bookmarkStart w:id="100023" w:name="_Toc100023"/>
       <w:r>
         <w:rPr>
           <w:rFonts w:ascii="Times New Roman" w:cs="Times New Roman" w:eastAsia="Times New Roman" w:hAnsi="Times New Roman"/>
@@ -10051,7 +7256,6 @@
         </w:rPr>
         <w:t xml:space="preserve">c) Cách đọc đuôi -ed (3 âm) — hay ra đề phát âm</w:t>
       </w:r>
-      <w:bookmarkEnd w:id="100023"/>
     </w:p>
     <w:p>
       <w:pPr>
@@ -10464,7 +7668,6 @@
         <w:keepNext/>
         <w:spacing w:after="80" w:before="200" w:line="312"/>
       </w:pPr>
-      <w:bookmarkStart w:id="100024" w:name="_Toc100024"/>
       <w:r>
         <w:rPr>
           <w:rFonts w:ascii="Times New Roman" w:cs="Times New Roman" w:eastAsia="Times New Roman" w:hAnsi="Times New Roman"/>
@@ -10476,7 +7679,6 @@
         </w:rPr>
         <w:t xml:space="preserve">d) Động từ bất quy tắc (V2) — nhóm theo slide</w:t>
       </w:r>
-      <w:bookmarkEnd w:id="100024"/>
     </w:p>
     <w:p>
       <w:pPr>
@@ -10621,7 +7823,6 @@
         <w:keepNext/>
         <w:spacing w:after="80" w:before="200" w:line="312"/>
       </w:pPr>
-      <w:bookmarkStart w:id="100025" w:name="_Toc100025"/>
       <w:r>
         <w:rPr>
           <w:rFonts w:ascii="Times New Roman" w:cs="Times New Roman" w:eastAsia="Times New Roman" w:hAnsi="Times New Roman"/>
@@ -10633,7 +7834,6 @@
         </w:rPr>
         <w:t xml:space="preserve">e) Thì quá khứ tiếp diễn (Past Continuous)</w:t>
       </w:r>
-      <w:bookmarkEnd w:id="100025"/>
     </w:p>
     <w:p>
       <w:pPr>
@@ -10776,7 +7976,6 @@
         <w:keepNext/>
         <w:spacing w:after="120" w:before="280" w:line="340" w:lineRule="atLeast"/>
       </w:pPr>
-      <w:bookmarkStart w:id="100026" w:name="_Toc100026"/>
       <w:r>
         <w:rPr>
           <w:rFonts w:ascii="Times New Roman" w:cs="Times New Roman" w:eastAsia="Times New Roman" w:hAnsi="Times New Roman"/>
@@ -10788,7 +7987,6 @@
         </w:rPr>
         <w:t xml:space="preserve">1.7. Unit 5 – Environment: Danh từ, lượng từ, mạo từ, made of/from</w:t>
       </w:r>
-      <w:bookmarkEnd w:id="100026"/>
     </w:p>
     <w:p>
       <w:pPr>
@@ -10796,7 +7994,6 @@
         <w:keepNext/>
         <w:spacing w:after="80" w:before="200" w:line="312"/>
       </w:pPr>
-      <w:bookmarkStart w:id="100027" w:name="_Toc100027"/>
       <w:r>
         <w:rPr>
           <w:rFonts w:ascii="Times New Roman" w:cs="Times New Roman" w:eastAsia="Times New Roman" w:hAnsi="Times New Roman"/>
@@ -10808,7 +8005,6 @@
         </w:rPr>
         <w:t xml:space="preserve">a) Danh từ đếm được và không đếm được</w:t>
       </w:r>
-      <w:bookmarkEnd w:id="100027"/>
     </w:p>
     <w:p>
       <w:pPr>
@@ -10905,7 +8101,6 @@
         <w:keepNext/>
         <w:spacing w:after="80" w:before="200" w:line="312"/>
       </w:pPr>
-      <w:bookmarkStart w:id="100028" w:name="_Toc100028"/>
       <w:r>
         <w:rPr>
           <w:rFonts w:ascii="Times New Roman" w:cs="Times New Roman" w:eastAsia="Times New Roman" w:hAnsi="Times New Roman"/>
@@ -10917,7 +8112,6 @@
         </w:rPr>
         <w:t xml:space="preserve">b) Made of / made from / made by / made in</w:t>
       </w:r>
-      <w:bookmarkEnd w:id="100028"/>
     </w:p>
     <w:p>
       <w:pPr>
@@ -11006,7 +8200,6 @@
         <w:keepNext/>
         <w:spacing w:after="80" w:before="200" w:line="312"/>
       </w:pPr>
-      <w:bookmarkStart w:id="100029" w:name="_Toc100029"/>
       <w:r>
         <w:rPr>
           <w:rFonts w:ascii="Times New Roman" w:cs="Times New Roman" w:eastAsia="Times New Roman" w:hAnsi="Times New Roman"/>
@@ -11018,7 +8211,6 @@
         </w:rPr>
         <w:t xml:space="preserve">c) Much, many, (a) little, (a) few, how much, how many</w:t>
       </w:r>
-      <w:bookmarkEnd w:id="100029"/>
     </w:p>
     <w:p>
       <w:pPr>
@@ -11377,7 +8569,6 @@
         <w:keepNext/>
         <w:spacing w:after="80" w:before="200" w:line="312"/>
       </w:pPr>
-      <w:bookmarkStart w:id="100030" w:name="_Toc100030"/>
       <w:r>
         <w:rPr>
           <w:rFonts w:ascii="Times New Roman" w:cs="Times New Roman" w:eastAsia="Times New Roman" w:hAnsi="Times New Roman"/>
@@ -11389,7 +8580,6 @@
         </w:rPr>
         <w:t xml:space="preserve">d) Some / any / no / enough</w:t>
       </w:r>
-      <w:bookmarkEnd w:id="100030"/>
     </w:p>
     <w:p>
       <w:pPr>
@@ -11505,7 +8695,6 @@
         <w:keepNext/>
         <w:spacing w:after="80" w:before="200" w:line="312"/>
       </w:pPr>
-      <w:bookmarkStart w:id="100031" w:name="_Toc100031"/>
       <w:r>
         <w:rPr>
           <w:rFonts w:ascii="Times New Roman" w:cs="Times New Roman" w:eastAsia="Times New Roman" w:hAnsi="Times New Roman"/>
@@ -11517,7 +8706,6 @@
         </w:rPr>
         <w:t xml:space="preserve">e) Mạo từ A / An / The / không dùng mạo từ</w:t>
       </w:r>
-      <w:bookmarkEnd w:id="100031"/>
     </w:p>
     <w:p>
       <w:pPr>
@@ -11633,7 +8821,6 @@
         <w:keepNext/>
         <w:spacing w:after="120" w:before="280" w:line="340" w:lineRule="atLeast"/>
       </w:pPr>
-      <w:bookmarkStart w:id="100032" w:name="_Toc100032"/>
       <w:r>
         <w:rPr>
           <w:rFonts w:ascii="Times New Roman" w:cs="Times New Roman" w:eastAsia="Times New Roman" w:hAnsi="Times New Roman"/>
@@ -11645,7 +8832,6 @@
         </w:rPr>
         <w:t xml:space="preserve">1.8. Unit 6 – Stages in Life: To-infinitive và các thì tương lai</w:t>
       </w:r>
-      <w:bookmarkEnd w:id="100032"/>
     </w:p>
     <w:p>
       <w:pPr>
@@ -11653,7 +8839,6 @@
         <w:keepNext/>
         <w:spacing w:after="80" w:before="200" w:line="312"/>
       </w:pPr>
-      <w:bookmarkStart w:id="100033" w:name="_Toc100033"/>
       <w:r>
         <w:rPr>
           <w:rFonts w:ascii="Times New Roman" w:cs="Times New Roman" w:eastAsia="Times New Roman" w:hAnsi="Times New Roman"/>
@@ -11665,7 +8850,6 @@
         </w:rPr>
         <w:t xml:space="preserve">a) Verb pattern with to-infinitive</w:t>
       </w:r>
-      <w:bookmarkEnd w:id="100033"/>
     </w:p>
     <w:p>
       <w:pPr>
@@ -11808,7 +8992,6 @@
         <w:keepNext/>
         <w:spacing w:after="80" w:before="200" w:line="312"/>
       </w:pPr>
-      <w:bookmarkStart w:id="100034" w:name="_Toc100034"/>
       <w:r>
         <w:rPr>
           <w:rFonts w:ascii="Times New Roman" w:cs="Times New Roman" w:eastAsia="Times New Roman" w:hAnsi="Times New Roman"/>
@@ -11820,7 +9003,6 @@
         </w:rPr>
         <w:t xml:space="preserve">b) Các dạng thì tương lai (Future forms)</w:t>
       </w:r>
-      <w:bookmarkEnd w:id="100034"/>
     </w:p>
     <w:p>
       <w:pPr>
@@ -12325,7 +9507,6 @@
         <w:keepNext/>
         <w:spacing w:after="120" w:before="280" w:line="340" w:lineRule="atLeast"/>
       </w:pPr>
-      <w:bookmarkStart w:id="100035" w:name="_Toc100035"/>
       <w:r>
         <w:rPr>
           <w:rFonts w:ascii="Times New Roman" w:cs="Times New Roman" w:eastAsia="Times New Roman" w:hAnsi="Times New Roman"/>
@@ -12337,7 +9518,6 @@
         </w:rPr>
         <w:t xml:space="preserve">1.9. Unit 7 – Work: Hiện tại hoàn thành (Present Perfect)</w:t>
       </w:r>
-      <w:bookmarkEnd w:id="100035"/>
     </w:p>
     <w:p>
       <w:pPr>
@@ -13540,7 +10720,6 @@
         <w:keepNext/>
         <w:spacing w:after="80" w:before="200" w:line="312"/>
       </w:pPr>
-      <w:bookmarkStart w:id="100036" w:name="_Toc100036"/>
       <w:r>
         <w:rPr>
           <w:rFonts w:ascii="Times New Roman" w:cs="Times New Roman" w:eastAsia="Times New Roman" w:hAnsi="Times New Roman"/>
@@ -13552,7 +10731,6 @@
         </w:rPr>
         <w:t xml:space="preserve">a) Been và Gone</w:t>
       </w:r>
-      <w:bookmarkEnd w:id="100036"/>
     </w:p>
     <w:p>
       <w:pPr>
@@ -13668,7 +10846,6 @@
         <w:keepNext/>
         <w:spacing w:after="80" w:before="200" w:line="312"/>
       </w:pPr>
-      <w:bookmarkStart w:id="100037" w:name="_Toc100037"/>
       <w:r>
         <w:rPr>
           <w:rFonts w:ascii="Times New Roman" w:cs="Times New Roman" w:eastAsia="Times New Roman" w:hAnsi="Times New Roman"/>
@@ -13680,7 +10857,6 @@
         </w:rPr>
         <w:t xml:space="preserve">b) Chuyển đổi câu: hiện tại hoàn thành ↔ quá khứ đơn (mẫu bất tử)</w:t>
       </w:r>
-      <w:bookmarkEnd w:id="100037"/>
     </w:p>
     <w:p>
       <w:pPr>
@@ -14165,7 +11341,6 @@
         <w:keepNext/>
         <w:spacing w:after="120" w:before="280" w:line="340" w:lineRule="atLeast"/>
       </w:pPr>
-      <w:bookmarkStart w:id="100038" w:name="_Toc100038"/>
       <w:r>
         <w:rPr>
           <w:rFonts w:ascii="Times New Roman" w:cs="Times New Roman" w:eastAsia="Times New Roman" w:hAnsi="Times New Roman"/>
@@ -14177,7 +11352,6 @@
         </w:rPr>
         <w:t xml:space="preserve">1.10. Unit 8 – Technology: Mệnh đề quan hệ (Relative clauses)</w:t>
       </w:r>
-      <w:bookmarkEnd w:id="100038"/>
     </w:p>
     <w:p>
       <w:pPr>
@@ -14200,7 +11374,6 @@
         <w:keepNext/>
         <w:spacing w:after="80" w:before="200" w:line="312"/>
       </w:pPr>
-      <w:bookmarkStart w:id="100039" w:name="_Toc100039"/>
       <w:r>
         <w:rPr>
           <w:rFonts w:ascii="Times New Roman" w:cs="Times New Roman" w:eastAsia="Times New Roman" w:hAnsi="Times New Roman"/>
@@ -14212,7 +11385,6 @@
         </w:rPr>
         <w:t xml:space="preserve">a) Đại từ quan hệ</w:t>
       </w:r>
-      <w:bookmarkEnd w:id="100039"/>
     </w:p>
     <w:p>
       <w:pPr>
@@ -14809,7 +11981,6 @@
         <w:keepNext/>
         <w:spacing w:after="80" w:before="200" w:line="312"/>
       </w:pPr>
-      <w:bookmarkStart w:id="100040" w:name="_Toc100040"/>
       <w:r>
         <w:rPr>
           <w:rFonts w:ascii="Times New Roman" w:cs="Times New Roman" w:eastAsia="Times New Roman" w:hAnsi="Times New Roman"/>
@@ -14821,7 +11992,6 @@
         </w:rPr>
         <w:t xml:space="preserve">b) Trạng từ quan hệ</w:t>
       </w:r>
-      <w:bookmarkEnd w:id="100040"/>
     </w:p>
     <w:p>
       <w:pPr>
@@ -14910,7 +12080,6 @@
         <w:keepNext/>
         <w:spacing w:after="80" w:before="200" w:line="312"/>
       </w:pPr>
-      <w:bookmarkStart w:id="100041" w:name="_Toc100041"/>
       <w:r>
         <w:rPr>
           <w:rFonts w:ascii="Times New Roman" w:cs="Times New Roman" w:eastAsia="Times New Roman" w:hAnsi="Times New Roman"/>
@@ -14922,7 +12091,6 @@
         </w:rPr>
         <w:t xml:space="preserve">c) Rút gọn và lược bỏ mệnh đề quan hệ</w:t>
       </w:r>
-      <w:bookmarkEnd w:id="100041"/>
     </w:p>
     <w:p>
       <w:pPr>
@@ -15038,7 +12206,6 @@
         <w:keepNext/>
         <w:spacing w:after="120" w:before="280" w:line="340" w:lineRule="atLeast"/>
       </w:pPr>
-      <w:bookmarkStart w:id="100042" w:name="_Toc100042"/>
       <w:r>
         <w:rPr>
           <w:rFonts w:ascii="Times New Roman" w:cs="Times New Roman" w:eastAsia="Times New Roman" w:hAnsi="Times New Roman"/>
@@ -15050,7 +12217,6 @@
         </w:rPr>
         <w:t xml:space="preserve">1.11. Câu điều kiện loại 0 và loại 1</w:t>
       </w:r>
-      <w:bookmarkEnd w:id="100042"/>
     </w:p>
     <w:p>
       <w:pPr>
@@ -15058,7 +12224,6 @@
         <w:keepNext/>
         <w:spacing w:after="80" w:before="200" w:line="312"/>
       </w:pPr>
-      <w:bookmarkStart w:id="100043" w:name="_Toc100043"/>
       <w:r>
         <w:rPr>
           <w:rFonts w:ascii="Times New Roman" w:cs="Times New Roman" w:eastAsia="Times New Roman" w:hAnsi="Times New Roman"/>
@@ -15070,7 +12235,6 @@
         </w:rPr>
         <w:t xml:space="preserve">a) Loại 0 — sự thật hiển nhiên, quy luật khoa học</w:t>
       </w:r>
-      <w:bookmarkEnd w:id="100043"/>
     </w:p>
     <w:p>
       <w:pPr>
@@ -15159,7 +12323,6 @@
         <w:keepNext/>
         <w:spacing w:after="80" w:before="200" w:line="312"/>
       </w:pPr>
-      <w:bookmarkStart w:id="100044" w:name="_Toc100044"/>
       <w:r>
         <w:rPr>
           <w:rFonts w:ascii="Times New Roman" w:cs="Times New Roman" w:eastAsia="Times New Roman" w:hAnsi="Times New Roman"/>
@@ -15171,7 +12334,6 @@
         </w:rPr>
         <w:t xml:space="preserve">b) Loại 1 — có thể xảy ra ở hiện tại hoặc tương lai</w:t>
       </w:r>
-      <w:bookmarkEnd w:id="100044"/>
     </w:p>
     <w:p>
       <w:pPr>
@@ -15314,7 +12476,6 @@
         <w:keepNext/>
         <w:spacing w:after="120" w:before="280" w:line="340" w:lineRule="atLeast"/>
       </w:pPr>
-      <w:bookmarkStart w:id="100045" w:name="_Toc100045"/>
       <w:r>
         <w:rPr>
           <w:rFonts w:ascii="Times New Roman" w:cs="Times New Roman" w:eastAsia="Times New Roman" w:hAnsi="Times New Roman"/>
@@ -15326,7 +12487,6 @@
         </w:rPr>
         <w:t xml:space="preserve">1.12. Unit 9 – Holidays: Quá khứ hoàn thành (Past Perfect)</w:t>
       </w:r>
-      <w:bookmarkEnd w:id="100045"/>
     </w:p>
     <w:p>
       <w:pPr>
@@ -15496,7 +12656,6 @@
         <w:keepNext/>
         <w:spacing w:after="120" w:before="280" w:line="340" w:lineRule="atLeast"/>
       </w:pPr>
-      <w:bookmarkStart w:id="100046" w:name="_Toc100046"/>
       <w:r>
         <w:rPr>
           <w:rFonts w:ascii="Times New Roman" w:cs="Times New Roman" w:eastAsia="Times New Roman" w:hAnsi="Times New Roman"/>
@@ -15508,7 +12667,6 @@
         </w:rPr>
         <w:t xml:space="preserve">1.13. Unit 10 – Products: Câu bị động (The passive)</w:t>
       </w:r>
-      <w:bookmarkEnd w:id="100046"/>
     </w:p>
     <w:p>
       <w:pPr>
@@ -16659,7 +13817,6 @@
         <w:keepNext/>
         <w:spacing w:after="160" w:before="360" w:line="380" w:lineRule="atLeast"/>
       </w:pPr>
-      <w:bookmarkStart w:id="100047" w:name="_Toc100047"/>
       <w:r>
         <w:rPr>
           <w:rFonts w:ascii="Times New Roman" w:cs="Times New Roman" w:eastAsia="Times New Roman" w:hAnsi="Times New Roman"/>
@@ -16671,7 +13828,6 @@
         </w:rPr>
         <w:t xml:space="preserve">PHẦN 2. VIẾT EMAIL THÂN MẬT (35–45 TỪ)</w:t>
       </w:r>
-      <w:bookmarkEnd w:id="100047"/>
     </w:p>
     <w:p>
       <w:pPr>
@@ -16694,7 +13850,6 @@
         <w:keepNext/>
         <w:spacing w:after="120" w:before="280" w:line="340" w:lineRule="atLeast"/>
       </w:pPr>
-      <w:bookmarkStart w:id="100048" w:name="_Toc100048"/>
       <w:r>
         <w:rPr>
           <w:rFonts w:ascii="Times New Roman" w:cs="Times New Roman" w:eastAsia="Times New Roman" w:hAnsi="Times New Roman"/>
@@ -16706,7 +13861,6 @@
         </w:rPr>
         <w:t xml:space="preserve">2.1. Cấu trúc email 5 phần</w:t>
       </w:r>
-      <w:bookmarkEnd w:id="100048"/>
     </w:p>
     <w:p>
       <w:pPr>
@@ -17128,7 +14282,6 @@
         <w:keepNext/>
         <w:spacing w:after="120" w:before="280" w:line="340" w:lineRule="atLeast"/>
       </w:pPr>
-      <w:bookmarkStart w:id="100049" w:name="_Toc100049"/>
       <w:r>
         <w:rPr>
           <w:rFonts w:ascii="Times New Roman" w:cs="Times New Roman" w:eastAsia="Times New Roman" w:hAnsi="Times New Roman"/>
@@ -17140,7 +14293,6 @@
         </w:rPr>
         <w:t xml:space="preserve">2.2. Bộ cụm từ chức năng theo ý đề</w:t>
       </w:r>
-      <w:bookmarkEnd w:id="100049"/>
     </w:p>
     <w:p>
       <w:pPr>
@@ -18003,7 +15155,6 @@
         <w:keepNext/>
         <w:spacing w:after="120" w:before="280" w:line="340" w:lineRule="atLeast"/>
       </w:pPr>
-      <w:bookmarkStart w:id="100050" w:name="_Toc100050"/>
       <w:r>
         <w:rPr>
           <w:rFonts w:ascii="Times New Roman" w:cs="Times New Roman" w:eastAsia="Times New Roman" w:hAnsi="Times New Roman"/>
@@ -18015,7 +15166,6 @@
         </w:rPr>
         <w:t xml:space="preserve">2.3. Hai bài mẫu trong slide</w:t>
       </w:r>
-      <w:bookmarkEnd w:id="100050"/>
     </w:p>
     <w:p>
       <w:pPr>
@@ -18023,7 +15173,6 @@
         <w:keepNext/>
         <w:spacing w:after="80" w:before="200" w:line="312"/>
       </w:pPr>
-      <w:bookmarkStart w:id="100051" w:name="_Toc100051"/>
       <w:r>
         <w:rPr>
           <w:rFonts w:ascii="Times New Roman" w:cs="Times New Roman" w:eastAsia="Times New Roman" w:hAnsi="Times New Roman"/>
@@ -18035,7 +15184,6 @@
         </w:rPr>
         <w:t xml:space="preserve">Bài mẫu 1 — Email cảm ơn (đề: kỳ nghỉ ở vùng quê)</w:t>
       </w:r>
-      <w:bookmarkEnd w:id="100051"/>
     </w:p>
     <w:p>
       <w:pPr>
@@ -18155,7 +15303,6 @@
         <w:keepNext/>
         <w:spacing w:after="80" w:before="200" w:line="312"/>
       </w:pPr>
-      <w:bookmarkStart w:id="100052" w:name="_Toc100052"/>
       <w:r>
         <w:rPr>
           <w:rFonts w:ascii="Times New Roman" w:cs="Times New Roman" w:eastAsia="Times New Roman" w:hAnsi="Times New Roman"/>
@@ -18167,7 +15314,6 @@
         </w:rPr>
         <w:t xml:space="preserve">Bài mẫu 2 — Email xin lỗi (đề: xin hoãn buổi thăm)</w:t>
       </w:r>
-      <w:bookmarkEnd w:id="100052"/>
     </w:p>
     <w:p>
       <w:pPr>
@@ -18254,7 +15400,6 @@
         <w:keepNext/>
         <w:spacing w:after="160" w:before="360" w:line="380" w:lineRule="atLeast"/>
       </w:pPr>
-      <w:bookmarkStart w:id="100053" w:name="_Toc100053"/>
       <w:r>
         <w:rPr>
           <w:rFonts w:ascii="Times New Roman" w:cs="Times New Roman" w:eastAsia="Times New Roman" w:hAnsi="Times New Roman"/>
@@ -18266,7 +15411,6 @@
         </w:rPr>
         <w:t xml:space="preserve">PHẦN 3. SPEAKING — CÂU HỎI THEO UNIT VÀ GỢI Ý TRẢ LỜI</w:t>
       </w:r>
-      <w:bookmarkEnd w:id="100053"/>
     </w:p>
     <w:p>
       <w:pPr>
@@ -18289,7 +15433,6 @@
         <w:keepNext/>
         <w:spacing w:after="120" w:before="280" w:line="340" w:lineRule="atLeast"/>
       </w:pPr>
-      <w:bookmarkStart w:id="100054" w:name="_Toc100054"/>
       <w:r>
         <w:rPr>
           <w:rFonts w:ascii="Times New Roman" w:cs="Times New Roman" w:eastAsia="Times New Roman" w:hAnsi="Times New Roman"/>
@@ -18301,7 +15444,6 @@
         </w:rPr>
         <w:t xml:space="preserve">3.1. Unit 1 – Lifestyle (sức khỏe)</w:t>
       </w:r>
-      <w:bookmarkEnd w:id="100054"/>
     </w:p>
     <w:p>
       <w:pPr>
@@ -18471,7 +15613,6 @@
         <w:keepNext/>
         <w:spacing w:after="120" w:before="280" w:line="340" w:lineRule="atLeast"/>
       </w:pPr>
-      <w:bookmarkStart w:id="100055" w:name="_Toc100055"/>
       <w:r>
         <w:rPr>
           <w:rFonts w:ascii="Times New Roman" w:cs="Times New Roman" w:eastAsia="Times New Roman" w:hAnsi="Times New Roman"/>
@@ -18483,7 +15624,6 @@
         </w:rPr>
         <w:t xml:space="preserve">3.2. Unit 2 – Competitions (cuộc thi / câu lạc bộ)</w:t>
       </w:r>
-      <w:bookmarkEnd w:id="100055"/>
     </w:p>
     <w:p>
       <w:pPr>
@@ -18599,7 +15739,6 @@
         <w:keepNext/>
         <w:spacing w:after="120" w:before="280" w:line="340" w:lineRule="atLeast"/>
       </w:pPr>
-      <w:bookmarkStart w:id="100056" w:name="_Toc100056"/>
       <w:r>
         <w:rPr>
           <w:rFonts w:ascii="Times New Roman" w:cs="Times New Roman" w:eastAsia="Times New Roman" w:hAnsi="Times New Roman"/>
@@ -18611,7 +15750,6 @@
         </w:rPr>
         <w:t xml:space="preserve">3.3. Unit 3 – Transport (phương tiện yêu thích)</w:t>
       </w:r>
-      <w:bookmarkEnd w:id="100056"/>
     </w:p>
     <w:p>
       <w:pPr>
@@ -18673,7 +15811,6 @@
         <w:keepNext/>
         <w:spacing w:after="120" w:before="280" w:line="340" w:lineRule="atLeast"/>
       </w:pPr>
-      <w:bookmarkStart w:id="100057" w:name="_Toc100057"/>
       <w:r>
         <w:rPr>
           <w:rFonts w:ascii="Times New Roman" w:cs="Times New Roman" w:eastAsia="Times New Roman" w:hAnsi="Times New Roman"/>
@@ -18685,7 +15822,6 @@
         </w:rPr>
         <w:t xml:space="preserve">3.4. Unit 4 – Challenges (kỳ nghỉ vừa rồi)</w:t>
       </w:r>
-      <w:bookmarkEnd w:id="100057"/>
     </w:p>
     <w:p>
       <w:pPr>
@@ -18747,7 +15883,6 @@
         <w:keepNext/>
         <w:spacing w:after="120" w:before="280" w:line="340" w:lineRule="atLeast"/>
       </w:pPr>
-      <w:bookmarkStart w:id="100058" w:name="_Toc100058"/>
       <w:r>
         <w:rPr>
           <w:rFonts w:ascii="Times New Roman" w:cs="Times New Roman" w:eastAsia="Times New Roman" w:hAnsi="Times New Roman"/>
@@ -18759,7 +15894,6 @@
         </w:rPr>
         <w:t xml:space="preserve">3.5. Unit 5 – Environment (môi trường &amp; quê hương)</w:t>
       </w:r>
-      <w:bookmarkEnd w:id="100058"/>
     </w:p>
     <w:p>
       <w:pPr>
@@ -18929,7 +16063,6 @@
         <w:keepNext/>
         <w:spacing w:after="160" w:before="360" w:line="380" w:lineRule="atLeast"/>
       </w:pPr>
-      <w:bookmarkStart w:id="100059" w:name="_Toc100059"/>
       <w:r>
         <w:rPr>
           <w:rFonts w:ascii="Times New Roman" w:cs="Times New Roman" w:eastAsia="Times New Roman" w:hAnsi="Times New Roman"/>
@@ -18941,7 +16074,6 @@
         </w:rPr>
         <w:t xml:space="preserve">PHẦN 4. BÀI TẬP TỰ LUYỆN CÓ ĐÁP ÁN</w:t>
       </w:r>
-      <w:bookmarkEnd w:id="100059"/>
     </w:p>
     <w:p>
       <w:pPr>
@@ -18964,7 +16096,6 @@
         <w:keepNext/>
         <w:spacing w:after="120" w:before="280" w:line="340" w:lineRule="atLeast"/>
       </w:pPr>
-      <w:bookmarkStart w:id="100060" w:name="_Toc100060"/>
       <w:r>
         <w:rPr>
           <w:rFonts w:ascii="Times New Roman" w:cs="Times New Roman" w:eastAsia="Times New Roman" w:hAnsi="Times New Roman"/>
@@ -18976,7 +16107,6 @@
         </w:rPr>
         <w:t xml:space="preserve">4.1. Viết lại câu: hiện tại hoàn thành ↔ quá khứ đơn</w:t>
       </w:r>
-      <w:bookmarkEnd w:id="100060"/>
     </w:p>
     <w:tbl>
       <w:tblPr>
@@ -19695,7 +16825,6 @@
         <w:keepNext/>
         <w:spacing w:after="120" w:before="280" w:line="340" w:lineRule="atLeast"/>
       </w:pPr>
-      <w:bookmarkStart w:id="100061" w:name="_Toc100061"/>
       <w:r>
         <w:rPr>
           <w:rFonts w:ascii="Times New Roman" w:cs="Times New Roman" w:eastAsia="Times New Roman" w:hAnsi="Times New Roman"/>
@@ -19707,7 +16836,6 @@
         </w:rPr>
         <w:t xml:space="preserve">4.2. Nối 2 câu dùng mệnh đề quan hệ (who/whom/which/whose/when)</w:t>
       </w:r>
-      <w:bookmarkEnd w:id="100061"/>
     </w:p>
     <w:tbl>
       <w:tblPr>
@@ -20678,7 +17806,6 @@
         <w:keepNext/>
         <w:spacing w:after="120" w:before="280" w:line="340" w:lineRule="atLeast"/>
       </w:pPr>
-      <w:bookmarkStart w:id="100062" w:name="_Toc100062"/>
       <w:r>
         <w:rPr>
           <w:rFonts w:ascii="Times New Roman" w:cs="Times New Roman" w:eastAsia="Times New Roman" w:hAnsi="Times New Roman"/>
@@ -20690,7 +17817,6 @@
         </w:rPr>
         <w:t xml:space="preserve">4.3. Đổi sang câu bị động</w:t>
       </w:r>
-      <w:bookmarkEnd w:id="100062"/>
     </w:p>
     <w:tbl>
       <w:tblPr>
@@ -21409,7 +18535,6 @@
         <w:keepNext/>
         <w:spacing w:after="120" w:before="280" w:line="340" w:lineRule="atLeast"/>
       </w:pPr>
-      <w:bookmarkStart w:id="100063" w:name="_Toc100063"/>
       <w:r>
         <w:rPr>
           <w:rFonts w:ascii="Times New Roman" w:cs="Times New Roman" w:eastAsia="Times New Roman" w:hAnsi="Times New Roman"/>
@@ -21421,7 +18546,6 @@
         </w:rPr>
         <w:t xml:space="preserve">4.4. Đổi sang câu chủ động</w:t>
       </w:r>
-      <w:bookmarkEnd w:id="100063"/>
     </w:p>
     <w:tbl>
       <w:tblPr>
@@ -22157,7 +19281,6 @@
         <w:keepNext/>
         <w:spacing w:after="160" w:before="360" w:line="380" w:lineRule="atLeast"/>
       </w:pPr>
-      <w:bookmarkStart w:id="100064" w:name="_Toc100064"/>
       <w:r>
         <w:rPr>
           <w:rFonts w:ascii="Times New Roman" w:cs="Times New Roman" w:eastAsia="Times New Roman" w:hAnsi="Times New Roman"/>
@@ -22169,7 +19292,6 @@
         </w:rPr>
         <w:t xml:space="preserve">PHỤ LỤC. BẢNG ĐỘNG TỪ BẤT QUY TẮC VÀ TỔNG KẾT CÁC THÌ</w:t>
       </w:r>
-      <w:bookmarkEnd w:id="100064"/>
     </w:p>
     <w:p>
       <w:pPr>
@@ -22177,7 +19299,6 @@
         <w:keepNext/>
         <w:spacing w:after="120" w:before="280" w:line="340" w:lineRule="atLeast"/>
       </w:pPr>
-      <w:bookmarkStart w:id="100065" w:name="_Toc100065"/>
       <w:r>
         <w:rPr>
           <w:rFonts w:ascii="Times New Roman" w:cs="Times New Roman" w:eastAsia="Times New Roman" w:hAnsi="Times New Roman"/>
@@ -22189,7 +19310,6 @@
         </w:rPr>
         <w:t xml:space="preserve">5.1. Động từ bất quy tắc cần thuộc (V1–V2–V3)</w:t>
       </w:r>
-      <w:bookmarkEnd w:id="100065"/>
     </w:p>
     <w:p>
       <w:pPr>
@@ -25638,7 +22758,6 @@
         <w:keepNext/>
         <w:spacing w:after="120" w:before="280" w:line="340" w:lineRule="atLeast"/>
       </w:pPr>
-      <w:bookmarkStart w:id="100066" w:name="_Toc100066"/>
       <w:r>
         <w:rPr>
           <w:rFonts w:ascii="Times New Roman" w:cs="Times New Roman" w:eastAsia="Times New Roman" w:hAnsi="Times New Roman"/>
@@ -25650,7 +22769,6 @@
         </w:rPr>
         <w:t xml:space="preserve">5.2. Tổng kết nhanh 6 thì + 2 dạng tương lai</w:t>
       </w:r>
-      <w:bookmarkEnd w:id="100066"/>
     </w:p>
     <w:tbl>
       <w:tblPr>
@@ -26505,7 +23623,6 @@
         <w:keepNext/>
         <w:spacing w:after="160" w:before="360" w:line="380" w:lineRule="atLeast"/>
       </w:pPr>
-      <w:bookmarkStart w:id="100067" w:name="_Toc100067"/>
       <w:r>
         <w:rPr>
           <w:rFonts w:ascii="Times New Roman" w:cs="Times New Roman" w:eastAsia="Times New Roman" w:hAnsi="Times New Roman"/>
@@ -26517,27 +23634,6 @@
         </w:rPr>
         <w:t xml:space="preserve">KẾT LUẬN</w:t>
       </w:r>
-      <w:bookmarkEnd w:id="100067"/>
-    </w:p>
-    <w:p>
-      <w:pPr>
-        <w:pStyle w:val="Heading2"/>
-        <w:keepNext/>
-        <w:spacing w:after="120" w:before="280" w:line="340" w:lineRule="atLeast"/>
-      </w:pPr>
-      <w:bookmarkStart w:id="100068" w:name="_Toc100068"/>
-      <w:r>
-        <w:rPr>
-          <w:rFonts w:ascii="Times New Roman" w:cs="Times New Roman" w:eastAsia="Times New Roman" w:hAnsi="Times New Roman"/>
-          <w:b/>
-          <w:bCs/>
-          <w:color w:val="1A3A3A"/>
-          <w:sz w:val="28"/>
-          <w:szCs w:val="28"/>
-        </w:rPr>
-        <w:t xml:space="preserve">1. Những kết quả đạt được</w:t>
-      </w:r>
-      <w:bookmarkEnd w:id="100068"/>
     </w:p>
     <w:p>
       <w:pPr>
@@ -26551,162 +23647,12 @@
           <w:sz w:val="24"/>
           <w:szCs w:val="24"/>
         </w:rPr>
-        <w:t xml:space="preserve">Quá trình tổng hợp báo cáo giúp em nhìn lại toàn bộ hành trình học của học kỳ và nhận thấy những tiến bộ rõ rệt. Về ngữ pháp, em đã nắm được bốn thì quan trọng nhất của tiếng Anh giao tiếp (hiện tại đơn, hiện tại tiếp diễn, quá khứ đơn, hiện tại hoàn thành) cùng các thì bổ trợ như quá khứ tiếp diễn, quá khứ hoàn thành và các dạng tương lai; biết cách vận dụng mạch lạc các chủ điểm còn lại như so sánh, lượng từ, mạo từ, mệnh đề quan hệ, câu bị động, câu điều kiện và động từ khuyết khuyết. Về kỹ năng, em viết được một email thân mật hoàn chỉnh 35–45 từ đúng bố cục chào – mở – thân – kết; tự tin trả lời các câu hỏi speaking quen thuộc về bản thân, gia đình, sở thích và kế hoạch tương lai.</w:t>
-      </w:r>
-    </w:p>
-    <w:p>
-      <w:pPr>
-        <w:spacing w:after="60" w:line="312"/>
-        <w:jc w:val="both"/>
-      </w:pPr>
-      <w:r>
-        <w:rPr>
-          <w:rFonts w:ascii="Times New Roman" w:cs="Times New Roman" w:eastAsia="Times New Roman" w:hAnsi="Times New Roman"/>
-          <w:color w:val="000000"/>
-          <w:sz w:val="24"/>
-          <w:szCs w:val="24"/>
-        </w:rPr>
-        <w:t xml:space="preserve">Kết quả tự kiểm tra ở Phần 4 cho thấy em làm đúng phần lớn các câu viết lại câu với hiện tại hoàn thành và câu bị động, hai dạng bài từng là điểm yếu ban đầu. Những lỗi còn mắc chủ yếu nằm ở dấu hiệu nhận biết thì (since/for, already/yet) và vị trí trạng từ tần suất, em đã ghi chú riêng các dấu hiệu này vào trang đầu vở để mỗi buổi học đều đọc qua một lần.</w:t>
-      </w:r>
-    </w:p>
-    <w:p>
-      <w:pPr>
-        <w:pStyle w:val="Heading2"/>
-        <w:keepNext/>
-        <w:spacing w:after="120" w:before="280" w:line="340" w:lineRule="atLeast"/>
-      </w:pPr>
-      <w:bookmarkStart w:id="100069" w:name="_Toc100069"/>
-      <w:r>
-        <w:rPr>
-          <w:rFonts w:ascii="Times New Roman" w:cs="Times New Roman" w:eastAsia="Times New Roman" w:hAnsi="Times New Roman"/>
-          <w:b/>
-          <w:bCs/>
-          <w:color w:val="1A3A3A"/>
-          <w:sz w:val="28"/>
-          <w:szCs w:val="28"/>
-        </w:rPr>
-        <w:t xml:space="preserve">2. Kế hoạch tự học tiếp theo</w:t>
-      </w:r>
-      <w:bookmarkEnd w:id="100069"/>
-    </w:p>
-    <w:p>
-      <w:pPr>
-        <w:pStyle w:val="ListParagraph"/>
-        <w:numPr>
-          <w:ilvl w:val="0"/>
-          <w:numId w:val="1"/>
-        </w:numPr>
-        <w:spacing w:after="40" w:line="312"/>
-        <w:jc w:val="left"/>
-      </w:pPr>
-      <w:r>
-        <w:rPr>
-          <w:rFonts w:ascii="Times New Roman" w:cs="Times New Roman" w:eastAsia="Times New Roman" w:hAnsi="Times New Roman"/>
-          <w:color w:val="000000"/>
-          <w:sz w:val="24"/>
-          <w:szCs w:val="24"/>
-        </w:rPr>
-        <w:t xml:space="preserve">Ôn lặp lại theo chu kỳ 1 ngày – 3 ngày – 7 ngày: đọc công thức, tự viết lại ví dụ không nhìn tài liệu.</w:t>
-      </w:r>
-    </w:p>
-    <w:p>
-      <w:pPr>
-        <w:pStyle w:val="ListParagraph"/>
-        <w:numPr>
-          <w:ilvl w:val="0"/>
-          <w:numId w:val="1"/>
-        </w:numPr>
-        <w:spacing w:after="40" w:line="312"/>
-        <w:jc w:val="left"/>
-      </w:pPr>
-      <w:r>
-        <w:rPr>
-          <w:rFonts w:ascii="Times New Roman" w:cs="Times New Roman" w:eastAsia="Times New Roman" w:hAnsi="Times New Roman"/>
-          <w:color w:val="000000"/>
-          <w:sz w:val="24"/>
-          <w:szCs w:val="24"/>
-        </w:rPr>
-        <w:t xml:space="preserve">Mỗi ngày làm 5 câu bài tập trộn lẫn từ Phần 4, giữ nhịp tiếp xúc đều với cả bốn dạng bài.</w:t>
-      </w:r>
-    </w:p>
-    <w:p>
-      <w:pPr>
-        <w:pStyle w:val="ListParagraph"/>
-        <w:numPr>
-          <w:ilvl w:val="0"/>
-          <w:numId w:val="1"/>
-        </w:numPr>
-        <w:spacing w:after="40" w:line="312"/>
-        <w:jc w:val="left"/>
-      </w:pPr>
-      <w:r>
-        <w:rPr>
-          <w:rFonts w:ascii="Times New Roman" w:cs="Times New Roman" w:eastAsia="Times New Roman" w:hAnsi="Times New Roman"/>
-          <w:color w:val="000000"/>
-          <w:sz w:val="24"/>
-          <w:szCs w:val="24"/>
-        </w:rPr>
-        <w:t xml:space="preserve">Học thuộc bảng động từ bất quy tắc theo nhóm 10 từ/ngày, tự kiểm tra bằng cách che 2 cột V2 – V3.</w:t>
-      </w:r>
-    </w:p>
-    <w:p>
-      <w:pPr>
-        <w:pStyle w:val="ListParagraph"/>
-        <w:numPr>
-          <w:ilvl w:val="0"/>
-          <w:numId w:val="1"/>
-        </w:numPr>
-        <w:spacing w:after="40" w:line="312"/>
-        <w:jc w:val="left"/>
-      </w:pPr>
-      <w:r>
-        <w:rPr>
-          <w:rFonts w:ascii="Times New Roman" w:cs="Times New Roman" w:eastAsia="Times New Roman" w:hAnsi="Times New Roman"/>
-          <w:color w:val="000000"/>
-          <w:sz w:val="24"/>
-          <w:szCs w:val="24"/>
-        </w:rPr>
-        <w:t xml:space="preserve">Mỗi tuần viết 1 email 40 từ và tự trả lời 3 câu speaking, ghi âm lại để nghe và sửa lỗi phát âm.</w:t>
-      </w:r>
-    </w:p>
-    <w:p>
-      <w:pPr>
-        <w:pStyle w:val="ListParagraph"/>
-        <w:numPr>
-          <w:ilvl w:val="0"/>
-          <w:numId w:val="1"/>
-        </w:numPr>
-        <w:spacing w:after="40" w:line="312"/>
-        <w:jc w:val="left"/>
-      </w:pPr>
-      <w:r>
-        <w:rPr>
-          <w:rFonts w:ascii="Times New Roman" w:cs="Times New Roman" w:eastAsia="Times New Roman" w:hAnsi="Times New Roman"/>
-          <w:color w:val="000000"/>
-          <w:sz w:val="24"/>
-          <w:szCs w:val="24"/>
-        </w:rPr>
-        <w:t xml:space="preserve">Ghi chú mọi lỗi sai vào cuối vở kèm nguyên nhân, xem lại trước mỗi buổi học.</w:t>
-      </w:r>
-    </w:p>
-    <w:p>
-      <w:pPr>
-        <w:spacing w:after="60" w:line="312"/>
-        <w:jc w:val="both"/>
-      </w:pPr>
-      <w:r>
-        <w:rPr>
-          <w:rFonts w:ascii="Times New Roman" w:cs="Times New Roman" w:eastAsia="Times New Roman" w:hAnsi="Times New Roman"/>
-          <w:color w:val="000000"/>
-          <w:sz w:val="24"/>
-          <w:szCs w:val="24"/>
-        </w:rPr>
-        <w:t xml:space="preserve">Em xin chân thành cảm ơn thầy cô đã giảng dạy và truyền cảm hứng cho em trong suốt học kỳ vừa qua. Báo cáo tự học này vừa là sản phẩm ôn tập cá nhân, vừa là lời cam kết rằng em sẽ tiếp tục duy trì thói quen tự học một cách hệ thống và nghiêm túc trong những học kỳ tiếp theo.</w:t>
+        <w:t xml:space="preserve">Qua việc tổng hợp báo cáo này, em đã hệ thống lại toàn bộ ngữ pháp và kỹ năng đã học, đồng thời tự kiểm tra qua các bài tập có đáp án. Những chỗ em còn yếu là dấu hiệu nhận biết thì (since/for, already/yet) và vị trí trạng từ tần suất, em sẽ tiếp tục ôn luyện hằng ngày để khắc phục. Em xin chân thành cảm ơn giảng viên đã hướng dẫn em trong học kỳ vừa qua.</w:t>
       </w:r>
     </w:p>
     <w:sectPr>
-      <w:headerReference w:type="default" r:id="rId8"/>
-      <w:footerReference w:type="default" r:id="rId9"/>
+      <w:headerReference w:type="default" r:id="rId7"/>
+      <w:footerReference w:type="default" r:id="rId8"/>
       <w:type w:val="nextPage"/>
       <w:pgSz w:w="11906" w:h="16838" w:orient="portrait"/>
       <w:pgMar w:top="1440" w:right="1417" w:bottom="1440" w:left="1701" w:header="708" w:footer="708" w:gutter="0"/>
@@ -26759,29 +23705,6 @@
 </file>
 
 <file path=word/footer1.xml><?xml version="1.0" encoding="utf-8"?>
-<w:ftr xmlns:wpc="http://schemas.microsoft.com/office/word/2010/wordprocessingCanvas" xmlns:mc="http://schemas.openxmlformats.org/markup-compatibility/2006" xmlns:o="urn:schemas-microsoft-com:office:office" xmlns:r="http://schemas.openxmlformats.org/officeDocument/2006/relationships" xmlns:m="http://schemas.openxmlformats.org/officeDocument/2006/math" xmlns:v="urn:schemas-microsoft-com:vml" xmlns:wp14="http://schemas.microsoft.com/office/word/2010/wordprocessingDrawing" xmlns:wp="http://schemas.openxmlformats.org/drawingml/2006/wordprocessingDrawing" xmlns:w10="urn:schemas-microsoft-com:office:word" xmlns:w="http://schemas.openxmlformats.org/wordprocessingml/2006/main" xmlns:w14="http://schemas.microsoft.com/office/word/2010/wordml" xmlns:w15="http://schemas.microsoft.com/office/word/2012/wordml" xmlns:wpg="http://schemas.microsoft.com/office/word/2010/wordprocessingGroup" xmlns:wpi="http://schemas.microsoft.com/office/word/2010/wordprocessingInk" xmlns:wne="http://schemas.microsoft.com/office/word/2006/wordml" xmlns:wps="http://schemas.microsoft.com/office/word/2010/wordprocessingShape">
-  <w:p>
-    <w:pPr>
-      <w:spacing w:line="240"/>
-      <w:jc w:val="center"/>
-    </w:pPr>
-    <w:r>
-      <w:rPr>
-        <w:rFonts w:ascii="Times New Roman" w:cs="Times New Roman" w:eastAsia="Times New Roman" w:hAnsi="Times New Roman"/>
-        <w:color w:val="888888"/>
-        <w:sz w:val="18"/>
-        <w:szCs w:val="18"/>
-      </w:rPr>
-      <w:fldChar w:fldCharType="begin"/>
-      <w:instrText xml:space="preserve"> PAGE \* ROMAN \* MERGEFORMAT </w:instrText>
-      <w:fldChar w:fldCharType="separate"/>
-      <w:fldChar w:fldCharType="end"/>
-    </w:r>
-  </w:p>
-</w:ftr>
-</file>
-
-<file path=word/footer2.xml><?xml version="1.0" encoding="utf-8"?>
 <w:ftr xmlns:wpc="http://schemas.microsoft.com/office/word/2010/wordprocessingCanvas" xmlns:mc="http://schemas.openxmlformats.org/markup-compatibility/2006" xmlns:o="urn:schemas-microsoft-com:office:office" xmlns:r="http://schemas.openxmlformats.org/officeDocument/2006/relationships" xmlns:m="http://schemas.openxmlformats.org/officeDocument/2006/math" xmlns:v="urn:schemas-microsoft-com:vml" xmlns:wp14="http://schemas.microsoft.com/office/word/2010/wordprocessingDrawing" xmlns:wp="http://schemas.openxmlformats.org/drawingml/2006/wordprocessingDrawing" xmlns:w10="urn:schemas-microsoft-com:office:word" xmlns:w="http://schemas.openxmlformats.org/wordprocessingml/2006/main" xmlns:w14="http://schemas.microsoft.com/office/word/2010/wordml" xmlns:w15="http://schemas.microsoft.com/office/word/2012/wordml" xmlns:wpg="http://schemas.microsoft.com/office/word/2010/wordprocessingGroup" xmlns:wpi="http://schemas.microsoft.com/office/word/2010/wordprocessingInk" xmlns:wne="http://schemas.microsoft.com/office/word/2006/wordml" xmlns:wps="http://schemas.microsoft.com/office/word/2010/wordprocessingShape">
   <w:p>
     <w:pPr>
@@ -27038,9 +23961,6 @@
     </w:rPr>
   </w:style>
   <w:style w:type="paragraph" w:styleId="Heading4">
-    <w:pPr>
-      <w:outlineLvl w:val="3"/>
-    </w:pPr>
     <w:name w:val="Heading 4"/>
     <w:basedOn w:val="Normal"/>
     <w:next w:val="Normal"/>
@@ -27052,9 +23972,6 @@
     </w:rPr>
   </w:style>
   <w:style w:type="paragraph" w:styleId="Heading5">
-    <w:pPr>
-      <w:outlineLvl w:val="4"/>
-    </w:pPr>
     <w:name w:val="Heading 5"/>
     <w:basedOn w:val="Normal"/>
     <w:next w:val="Normal"/>
@@ -27064,9 +23981,6 @@
     </w:rPr>
   </w:style>
   <w:style w:type="paragraph" w:styleId="Heading6">
-    <w:pPr>
-      <w:outlineLvl w:val="5"/>
-    </w:pPr>
     <w:name w:val="Heading 6"/>
     <w:basedOn w:val="Normal"/>
     <w:next w:val="Normal"/>
@@ -27174,44 +24088,5 @@
       <w:szCs w:val="20"/>
     </w:rPr>
   </w:style>
-  <w:style xmlns:w="http://schemas.openxmlformats.org/wordprocessingml/2006/main" w:type="paragraph" w:styleId="9">
-    <w:name w:val="toc 1"/>
-    <w:basedOn w:val="Normal"/>
-    <w:uiPriority w:val="39"/>
-    <w:pPr>
-      <w:tabs>
-        <w:tab w:val="right" w:leader="dot" w:pos="9026"/>
-      </w:tabs>
-      <w:spacing w:before="120" w:after="60"/>
-    </w:pPr>
-    <w:rPr>
-      <w:b/>
-      <w:bCs/>
-    </w:rPr>
-  </w:style>
-  <w:style xmlns:w="http://schemas.openxmlformats.org/wordprocessingml/2006/main" w:type="paragraph" w:styleId="11">
-    <w:name w:val="toc 2"/>
-    <w:basedOn w:val="Normal"/>
-    <w:uiPriority w:val="39"/>
-    <w:pPr>
-      <w:tabs>
-        <w:tab w:val="right" w:leader="dot" w:pos="9026"/>
-      </w:tabs>
-      <w:ind w:left="360"/>
-      <w:spacing w:before="60" w:after="40"/>
-    </w:pPr>
-  </w:style>
-  <w:style xmlns:w="http://schemas.openxmlformats.org/wordprocessingml/2006/main" w:type="paragraph" w:styleId="12">
-    <w:name w:val="toc 3"/>
-    <w:basedOn w:val="Normal"/>
-    <w:uiPriority w:val="39"/>
-    <w:pPr>
-      <w:tabs>
-        <w:tab w:val="right" w:leader="dot" w:pos="9026"/>
-      </w:tabs>
-      <w:ind w:left="720"/>
-      <w:spacing w:before="40" w:after="20"/>
-    </w:pPr>
-  </w:style>
 </w:styles>
 </file>
</xml_diff>